<commit_message>
Final slides and report
</commit_message>
<xml_diff>
--- a/Project1/Reports/Jegede_Project1_SecondaryAnalysis_of_the_Multicenter_AIDS_Cohort_Study.docx
+++ b/Project1/Reports/Jegede_Project1_SecondaryAnalysis_of_the_Multicenter_AIDS_Cohort_Study.docx
@@ -807,7 +807,37 @@
         <w:rPr>
           <w:rFonts w:ascii="Times New Roman" w:hAnsi="Times New Roman" w:cs="Times New Roman"/>
         </w:rPr>
-        <w:t>residual</w:t>
+        <w:t xml:space="preserve">residual </w:t>
+      </w:r>
+      <w:r>
+        <w:rPr>
+          <w:rFonts w:ascii="Times New Roman" w:hAnsi="Times New Roman" w:cs="Times New Roman"/>
+        </w:rPr>
+        <w:t xml:space="preserve">variance. The mean and </w:t>
+      </w:r>
+      <w:r>
+        <w:rPr>
+          <w:rFonts w:ascii="Times New Roman" w:hAnsi="Times New Roman" w:cs="Times New Roman"/>
+        </w:rPr>
+        <w:t xml:space="preserve">variance of the priors for the coefficients and intercept term, for the QoL and CD4+ T-cell count </w:t>
+      </w:r>
+      <w:r>
+        <w:rPr>
+          <w:rFonts w:ascii="Times New Roman" w:hAnsi="Times New Roman" w:cs="Times New Roman"/>
+        </w:rPr>
+        <w:t>outcome</w:t>
+      </w:r>
+      <w:r>
+        <w:rPr>
+          <w:rFonts w:ascii="Times New Roman" w:hAnsi="Times New Roman" w:cs="Times New Roman"/>
+        </w:rPr>
+        <w:t xml:space="preserve"> models, were drawn from a normal distribution with mean</w:t>
+      </w:r>
+      <w:r>
+        <w:rPr>
+          <w:rFonts w:ascii="Times New Roman" w:hAnsi="Times New Roman" w:cs="Times New Roman"/>
+        </w:rPr>
+        <w:t xml:space="preserve"> of</w:t>
       </w:r>
       <w:r>
         <w:rPr>
@@ -819,32 +849,54 @@
         <w:rPr>
           <w:rFonts w:ascii="Times New Roman" w:hAnsi="Times New Roman" w:cs="Times New Roman"/>
         </w:rPr>
-        <w:t xml:space="preserve">variance. The mean and </w:t>
-      </w:r>
-      <w:r>
-        <w:rPr>
-          <w:rFonts w:ascii="Times New Roman" w:hAnsi="Times New Roman" w:cs="Times New Roman"/>
-        </w:rPr>
-        <w:t xml:space="preserve">variance of the priors for the coefficients and intercept term, for the QoL and CD4+ T-cell count </w:t>
-      </w:r>
-      <w:r>
-        <w:rPr>
-          <w:rFonts w:ascii="Times New Roman" w:hAnsi="Times New Roman" w:cs="Times New Roman"/>
-        </w:rPr>
-        <w:t>outcome</w:t>
-      </w:r>
-      <w:r>
-        <w:rPr>
-          <w:rFonts w:ascii="Times New Roman" w:hAnsi="Times New Roman" w:cs="Times New Roman"/>
-        </w:rPr>
-        <w:t xml:space="preserve"> models, were drawn from a normal distribution with mean</w:t>
-      </w:r>
-      <w:r>
-        <w:rPr>
-          <w:rFonts w:ascii="Times New Roman" w:hAnsi="Times New Roman" w:cs="Times New Roman"/>
-        </w:rPr>
-        <w:t xml:space="preserve"> of</w:t>
-      </w:r>
+        <w:t xml:space="preserve">0 </w:t>
+      </w:r>
+      <w:r>
+        <w:rPr>
+          <w:rFonts w:ascii="Times New Roman" w:hAnsi="Times New Roman" w:cs="Times New Roman"/>
+        </w:rPr>
+        <w:t>and variance of 100</w:t>
+      </w:r>
+      <w:r>
+        <w:rPr>
+          <w:rFonts w:ascii="Times New Roman" w:hAnsi="Times New Roman" w:cs="Times New Roman"/>
+          <w:vertAlign w:val="superscript"/>
+        </w:rPr>
+        <w:t>2</w:t>
+      </w:r>
+      <w:r>
+        <w:rPr>
+          <w:rFonts w:ascii="Times New Roman" w:hAnsi="Times New Roman" w:cs="Times New Roman"/>
+        </w:rPr>
+        <w:t>, while for the standardized viral load model, a mean of 1 with the same variance was specified because of the log</w:t>
+      </w:r>
+      <w:r>
+        <w:rPr>
+          <w:rFonts w:ascii="Times New Roman" w:hAnsi="Times New Roman" w:cs="Times New Roman"/>
+          <w:vertAlign w:val="subscript"/>
+        </w:rPr>
+        <w:t>10</w:t>
+      </w:r>
+      <w:r>
+        <w:rPr>
+          <w:rFonts w:ascii="Times New Roman" w:hAnsi="Times New Roman" w:cs="Times New Roman"/>
+        </w:rPr>
+        <w:t xml:space="preserve"> transformation. For all 4 models, </w:t>
+      </w:r>
+      <w:r>
+        <w:rPr>
+          <w:rFonts w:ascii="Times New Roman" w:hAnsi="Times New Roman" w:cs="Times New Roman"/>
+        </w:rPr>
+        <w:t xml:space="preserve">a half normal non-informative </w:t>
+      </w:r>
+      <w:proofErr w:type="gramStart"/>
+      <w:r>
+        <w:rPr>
+          <w:rFonts w:ascii="Times New Roman" w:hAnsi="Times New Roman" w:cs="Times New Roman"/>
+        </w:rPr>
+        <w:t>prior</w:t>
+      </w:r>
+      <w:proofErr w:type="gramEnd"/>
       <w:r>
         <w:rPr>
           <w:rFonts w:ascii="Times New Roman" w:hAnsi="Times New Roman" w:cs="Times New Roman"/>
@@ -855,13 +907,31 @@
         <w:rPr>
           <w:rFonts w:ascii="Times New Roman" w:hAnsi="Times New Roman" w:cs="Times New Roman"/>
         </w:rPr>
-        <w:t xml:space="preserve">0 </w:t>
-      </w:r>
-      <w:r>
-        <w:rPr>
-          <w:rFonts w:ascii="Times New Roman" w:hAnsi="Times New Roman" w:cs="Times New Roman"/>
-        </w:rPr>
-        <w:t>and variance of 100</w:t>
+        <w:t xml:space="preserve">with mean </w:t>
+      </w:r>
+      <w:r>
+        <w:rPr>
+          <w:rFonts w:ascii="Times New Roman" w:hAnsi="Times New Roman" w:cs="Times New Roman"/>
+        </w:rPr>
+        <w:t xml:space="preserve">of 0 </w:t>
+      </w:r>
+      <w:r>
+        <w:rPr>
+          <w:rFonts w:ascii="Times New Roman" w:hAnsi="Times New Roman" w:cs="Times New Roman"/>
+        </w:rPr>
+        <w:t>and variance</w:t>
+      </w:r>
+      <w:r>
+        <w:rPr>
+          <w:rFonts w:ascii="Times New Roman" w:hAnsi="Times New Roman" w:cs="Times New Roman"/>
+        </w:rPr>
+        <w:t xml:space="preserve"> </w:t>
+      </w:r>
+      <w:r>
+        <w:rPr>
+          <w:rFonts w:ascii="Times New Roman" w:hAnsi="Times New Roman" w:cs="Times New Roman"/>
+        </w:rPr>
+        <w:t>100</w:t>
       </w:r>
       <w:r>
         <w:rPr>
@@ -874,81 +944,13 @@
         <w:rPr>
           <w:rFonts w:ascii="Times New Roman" w:hAnsi="Times New Roman" w:cs="Times New Roman"/>
         </w:rPr>
-        <w:t>, while for the standardized viral load model, a mean of 1 with the same variance was specified because of the log</w:t>
-      </w:r>
-      <w:r>
-        <w:rPr>
-          <w:rFonts w:ascii="Times New Roman" w:hAnsi="Times New Roman" w:cs="Times New Roman"/>
-          <w:vertAlign w:val="subscript"/>
-        </w:rPr>
-        <w:t>10</w:t>
-      </w:r>
-      <w:r>
-        <w:rPr>
-          <w:rFonts w:ascii="Times New Roman" w:hAnsi="Times New Roman" w:cs="Times New Roman"/>
-        </w:rPr>
-        <w:t xml:space="preserve"> transformation. For all 4 models, </w:t>
-      </w:r>
-      <w:r>
-        <w:rPr>
-          <w:rFonts w:ascii="Times New Roman" w:hAnsi="Times New Roman" w:cs="Times New Roman"/>
-        </w:rPr>
-        <w:t xml:space="preserve">a half normal non-informative prior </w:t>
-      </w:r>
-      <w:r>
-        <w:rPr>
-          <w:rFonts w:ascii="Times New Roman" w:hAnsi="Times New Roman" w:cs="Times New Roman"/>
-        </w:rPr>
-        <w:t xml:space="preserve">with mean </w:t>
-      </w:r>
-      <w:r>
-        <w:rPr>
-          <w:rFonts w:ascii="Times New Roman" w:hAnsi="Times New Roman" w:cs="Times New Roman"/>
-        </w:rPr>
-        <w:t xml:space="preserve">of 0 </w:t>
-      </w:r>
-      <w:r>
-        <w:rPr>
-          <w:rFonts w:ascii="Times New Roman" w:hAnsi="Times New Roman" w:cs="Times New Roman"/>
-        </w:rPr>
-        <w:t>and variance</w:t>
-      </w:r>
-      <w:r>
-        <w:rPr>
-          <w:rFonts w:ascii="Times New Roman" w:hAnsi="Times New Roman" w:cs="Times New Roman"/>
-        </w:rPr>
         <w:t xml:space="preserve"> </w:t>
       </w:r>
       <w:r>
         <w:rPr>
           <w:rFonts w:ascii="Times New Roman" w:hAnsi="Times New Roman" w:cs="Times New Roman"/>
         </w:rPr>
-        <w:t>100</w:t>
-      </w:r>
-      <w:r>
-        <w:rPr>
-          <w:rFonts w:ascii="Times New Roman" w:hAnsi="Times New Roman" w:cs="Times New Roman"/>
-          <w:vertAlign w:val="superscript"/>
-        </w:rPr>
-        <w:t>2</w:t>
-      </w:r>
-      <w:r>
-        <w:rPr>
-          <w:rFonts w:ascii="Times New Roman" w:hAnsi="Times New Roman" w:cs="Times New Roman"/>
-        </w:rPr>
-        <w:t xml:space="preserve"> </w:t>
-      </w:r>
-      <w:r>
-        <w:rPr>
-          <w:rFonts w:ascii="Times New Roman" w:hAnsi="Times New Roman" w:cs="Times New Roman"/>
-        </w:rPr>
-        <w:t>was specifie</w:t>
-      </w:r>
-      <w:r>
-        <w:rPr>
-          <w:rFonts w:ascii="Times New Roman" w:hAnsi="Times New Roman" w:cs="Times New Roman"/>
-        </w:rPr>
-        <w:t>d</w:t>
+        <w:t>was specified</w:t>
       </w:r>
       <w:r>
         <w:rPr>
@@ -992,13 +994,7 @@
         <w:rPr>
           <w:rFonts w:ascii="Times New Roman" w:hAnsi="Times New Roman" w:cs="Times New Roman"/>
         </w:rPr>
-        <w:t xml:space="preserve"> package </w:t>
-      </w:r>
-      <w:r>
-        <w:rPr>
-          <w:rFonts w:ascii="Times New Roman" w:hAnsi="Times New Roman" w:cs="Times New Roman"/>
-        </w:rPr>
-        <w:t>in R</w:t>
+        <w:t xml:space="preserve"> package in R</w:t>
       </w:r>
       <w:r>
         <w:rPr>
@@ -1010,19 +1006,7 @@
         <w:rPr>
           <w:rFonts w:ascii="Times New Roman" w:hAnsi="Times New Roman" w:cs="Times New Roman"/>
         </w:rPr>
-        <w:t xml:space="preserve">. Stan simulates the posterior distribution of the model estimates with </w:t>
-      </w:r>
-      <w:r>
-        <w:rPr>
-          <w:rFonts w:ascii="Times New Roman" w:hAnsi="Times New Roman" w:cs="Times New Roman"/>
-        </w:rPr>
-        <w:t>Hamiltonian Monte Carlo using the No U-Turn Sample</w:t>
-      </w:r>
-      <w:r>
-        <w:rPr>
-          <w:rFonts w:ascii="Times New Roman" w:hAnsi="Times New Roman" w:cs="Times New Roman"/>
-        </w:rPr>
-        <w:t xml:space="preserve">r. Four (4) chains were run each with </w:t>
+        <w:t xml:space="preserve">. Stan simulates the posterior distribution of the model estimates with Hamiltonian Monte Carlo using the No U-Turn Sampler. Four (4) chains were run each with </w:t>
       </w:r>
       <w:r>
         <w:rPr>
@@ -1065,25 +1049,27 @@
         <w:rPr>
           <w:rFonts w:ascii="Times New Roman" w:hAnsi="Times New Roman" w:cs="Times New Roman"/>
         </w:rPr>
-        <w:t xml:space="preserve">Such high iterations for warm-up and keeping were drawn so as to improve converge characteristics. </w:t>
-      </w:r>
-      <w:r>
-        <w:rPr>
-          <w:rFonts w:ascii="Times New Roman" w:hAnsi="Times New Roman" w:cs="Times New Roman"/>
-        </w:rPr>
-        <w:t>A</w:t>
-      </w:r>
-      <w:r>
-        <w:rPr>
-          <w:rFonts w:ascii="Times New Roman" w:hAnsi="Times New Roman" w:cs="Times New Roman"/>
-        </w:rPr>
-        <w:t>utocorrelation plots</w:t>
-      </w:r>
-      <w:r>
-        <w:rPr>
-          <w:rFonts w:ascii="Times New Roman" w:hAnsi="Times New Roman" w:cs="Times New Roman"/>
-        </w:rPr>
-        <w:t>, trace plots,</w:t>
+        <w:t xml:space="preserve">Such high iterations for warm-up and keeping were drawn </w:t>
+      </w:r>
+      <w:proofErr w:type="gramStart"/>
+      <w:r>
+        <w:rPr>
+          <w:rFonts w:ascii="Times New Roman" w:hAnsi="Times New Roman" w:cs="Times New Roman"/>
+        </w:rPr>
+        <w:t>so as to</w:t>
+      </w:r>
+      <w:proofErr w:type="gramEnd"/>
+      <w:r>
+        <w:rPr>
+          <w:rFonts w:ascii="Times New Roman" w:hAnsi="Times New Roman" w:cs="Times New Roman"/>
+        </w:rPr>
+        <w:t xml:space="preserve"> improve converge characteristics. </w:t>
+      </w:r>
+      <w:r>
+        <w:rPr>
+          <w:rFonts w:ascii="Times New Roman" w:hAnsi="Times New Roman" w:cs="Times New Roman"/>
+        </w:rPr>
+        <w:t>Autocorrelation plots, trace plots,</w:t>
       </w:r>
       <w:r>
         <w:rPr>
@@ -1131,31 +1117,7 @@
         <w:rPr>
           <w:rFonts w:ascii="Times New Roman" w:hAnsi="Times New Roman" w:cs="Times New Roman"/>
         </w:rPr>
-        <w:t xml:space="preserve">odel comparison </w:t>
-      </w:r>
-      <w:r>
-        <w:rPr>
-          <w:rFonts w:ascii="Times New Roman" w:hAnsi="Times New Roman" w:cs="Times New Roman"/>
-        </w:rPr>
-        <w:t>was</w:t>
-      </w:r>
-      <w:r>
-        <w:rPr>
-          <w:rFonts w:ascii="Times New Roman" w:hAnsi="Times New Roman" w:cs="Times New Roman"/>
-        </w:rPr>
-        <w:t xml:space="preserve"> based on the Widely Applicable Information Criterion (WAIC)</w:t>
-      </w:r>
-      <w:r>
-        <w:rPr>
-          <w:rFonts w:ascii="Times New Roman" w:hAnsi="Times New Roman" w:cs="Times New Roman"/>
-        </w:rPr>
-        <w:t xml:space="preserve"> </w:t>
-      </w:r>
-      <w:r>
-        <w:rPr>
-          <w:rFonts w:ascii="Times New Roman" w:hAnsi="Times New Roman" w:cs="Times New Roman"/>
-        </w:rPr>
-        <w:t>statistics</w:t>
+        <w:t>odel comparison was based on the Widely Applicable Information Criterion (WAIC) statistics</w:t>
       </w:r>
       <w:r>
         <w:rPr>
@@ -1205,7 +1167,21 @@
         <w:rPr>
           <w:rFonts w:ascii="Times New Roman" w:hAnsi="Times New Roman" w:cs="Times New Roman"/>
         </w:rPr>
-        <w:t xml:space="preserve"> variable, a univariable, crude, and adjusted model. The univariable model has hard drug use as the only predictor. The crude model includes all the pre-specified covariates </w:t>
+        <w:t xml:space="preserve"> variable, </w:t>
+      </w:r>
+      <w:proofErr w:type="gramStart"/>
+      <w:r>
+        <w:rPr>
+          <w:rFonts w:ascii="Times New Roman" w:hAnsi="Times New Roman" w:cs="Times New Roman"/>
+        </w:rPr>
+        <w:t>a univariable</w:t>
+      </w:r>
+      <w:proofErr w:type="gramEnd"/>
+      <w:r>
+        <w:rPr>
+          <w:rFonts w:ascii="Times New Roman" w:hAnsi="Times New Roman" w:cs="Times New Roman"/>
+        </w:rPr>
+        <w:t xml:space="preserve">, crude, and adjusted model. The univariable model has hard drug use as the only predictor. The crude model includes all the pre-specified covariates </w:t>
       </w:r>
       <w:r>
         <w:rPr>
@@ -1259,19 +1235,7 @@
         <w:rPr>
           <w:rFonts w:ascii="Times New Roman" w:hAnsi="Times New Roman" w:cs="Times New Roman"/>
         </w:rPr>
-        <w:t>to adjust for between-subject difference</w:t>
-      </w:r>
-      <w:r>
-        <w:rPr>
-          <w:rFonts w:ascii="Times New Roman" w:hAnsi="Times New Roman" w:cs="Times New Roman"/>
-        </w:rPr>
-        <w:t>s</w:t>
-      </w:r>
-      <w:r>
-        <w:rPr>
-          <w:rFonts w:ascii="Times New Roman" w:hAnsi="Times New Roman" w:cs="Times New Roman"/>
-        </w:rPr>
-        <w:t xml:space="preserve"> at baseline</w:t>
+        <w:t>to adjust for between-subject differences at baseline</w:t>
       </w:r>
       <w:r>
         <w:rPr>
@@ -1403,7 +1367,21 @@
         <w:rPr>
           <w:rFonts w:ascii="Times New Roman" w:hAnsi="Times New Roman" w:cs="Times New Roman"/>
         </w:rPr>
-        <w:t xml:space="preserve">formal mediation analysis for treatment adherence was performed. The posterior mean with 95% HPDI of the indirect effect of mediation was estimated </w:t>
+        <w:t xml:space="preserve">formal mediation analysis for treatment adherence was performed. The posterior </w:t>
+      </w:r>
+      <w:proofErr w:type="gramStart"/>
+      <w:r>
+        <w:rPr>
+          <w:rFonts w:ascii="Times New Roman" w:hAnsi="Times New Roman" w:cs="Times New Roman"/>
+        </w:rPr>
+        <w:t>mean</w:t>
+      </w:r>
+      <w:proofErr w:type="gramEnd"/>
+      <w:r>
+        <w:rPr>
+          <w:rFonts w:ascii="Times New Roman" w:hAnsi="Times New Roman" w:cs="Times New Roman"/>
+        </w:rPr>
+        <w:t xml:space="preserve"> with 95% HPDI of the indirect effect of mediation was estimated </w:t>
       </w:r>
       <w:r>
         <w:rPr>
@@ -1469,54 +1447,76 @@
         <w:rPr>
           <w:rFonts w:ascii="Times New Roman" w:hAnsi="Times New Roman" w:cs="Times New Roman"/>
         </w:rPr>
+        <w:t xml:space="preserve"> In additio</w:t>
+      </w:r>
+      <w:r>
+        <w:rPr>
+          <w:rFonts w:ascii="Times New Roman" w:hAnsi="Times New Roman" w:cs="Times New Roman"/>
+        </w:rPr>
+        <w:t>n</w:t>
+      </w:r>
+      <w:r>
+        <w:rPr>
+          <w:rFonts w:ascii="Times New Roman" w:hAnsi="Times New Roman" w:cs="Times New Roman"/>
+        </w:rPr>
+        <w:t xml:space="preserve">, the posterior probability of a clinically meaningful change between hard drug </w:t>
+      </w:r>
+      <w:proofErr w:type="gramStart"/>
+      <w:r>
+        <w:rPr>
+          <w:rFonts w:ascii="Times New Roman" w:hAnsi="Times New Roman" w:cs="Times New Roman"/>
+        </w:rPr>
+        <w:t>user</w:t>
+      </w:r>
+      <w:proofErr w:type="gramEnd"/>
+      <w:r>
+        <w:rPr>
+          <w:rFonts w:ascii="Times New Roman" w:hAnsi="Times New Roman" w:cs="Times New Roman"/>
+        </w:rPr>
+        <w:t xml:space="preserve"> and non-</w:t>
+      </w:r>
+      <w:proofErr w:type="gramStart"/>
+      <w:r>
+        <w:rPr>
+          <w:rFonts w:ascii="Times New Roman" w:hAnsi="Times New Roman" w:cs="Times New Roman"/>
+        </w:rPr>
+        <w:t>user</w:t>
+      </w:r>
+      <w:proofErr w:type="gramEnd"/>
+      <w:r>
+        <w:rPr>
+          <w:rFonts w:ascii="Times New Roman" w:hAnsi="Times New Roman" w:cs="Times New Roman"/>
+        </w:rPr>
+        <w:t xml:space="preserve"> at baseline was estimated and tabulated for each treatment response. Clinically meaningful change</w:t>
+      </w:r>
+      <w:r>
+        <w:rPr>
+          <w:rFonts w:ascii="Times New Roman" w:hAnsi="Times New Roman" w:cs="Times New Roman"/>
+        </w:rPr>
+        <w:t xml:space="preserve">, </w:t>
+      </w:r>
+      <w:r>
+        <w:rPr>
+          <w:rFonts w:ascii="Times New Roman" w:hAnsi="Times New Roman" w:cs="Times New Roman"/>
+        </w:rPr>
+        <w:t>provided by the investigator</w:t>
+      </w:r>
+      <w:r>
+        <w:rPr>
+          <w:rFonts w:ascii="Times New Roman" w:hAnsi="Times New Roman" w:cs="Times New Roman"/>
+        </w:rPr>
+        <w:t>,</w:t>
+      </w:r>
+      <w:r>
+        <w:rPr>
+          <w:rFonts w:ascii="Times New Roman" w:hAnsi="Times New Roman" w:cs="Times New Roman"/>
+        </w:rPr>
         <w:t xml:space="preserve"> </w:t>
       </w:r>
       <w:r>
         <w:rPr>
           <w:rFonts w:ascii="Times New Roman" w:hAnsi="Times New Roman" w:cs="Times New Roman"/>
         </w:rPr>
-        <w:t>In additio</w:t>
-      </w:r>
-      <w:r>
-        <w:rPr>
-          <w:rFonts w:ascii="Times New Roman" w:hAnsi="Times New Roman" w:cs="Times New Roman"/>
-        </w:rPr>
-        <w:t>n</w:t>
-      </w:r>
-      <w:r>
-        <w:rPr>
-          <w:rFonts w:ascii="Times New Roman" w:hAnsi="Times New Roman" w:cs="Times New Roman"/>
-        </w:rPr>
-        <w:t>, the posterior probability of a clinically meaningful change between hard drug user and non-user at baseline was estimated and tabulated for each treatment response. Clinically meaningful change</w:t>
-      </w:r>
-      <w:r>
-        <w:rPr>
-          <w:rFonts w:ascii="Times New Roman" w:hAnsi="Times New Roman" w:cs="Times New Roman"/>
-        </w:rPr>
-        <w:t xml:space="preserve">, </w:t>
-      </w:r>
-      <w:r>
-        <w:rPr>
-          <w:rFonts w:ascii="Times New Roman" w:hAnsi="Times New Roman" w:cs="Times New Roman"/>
-        </w:rPr>
-        <w:t>provided by the investigator</w:t>
-      </w:r>
-      <w:r>
-        <w:rPr>
-          <w:rFonts w:ascii="Times New Roman" w:hAnsi="Times New Roman" w:cs="Times New Roman"/>
-        </w:rPr>
-        <w:t>,</w:t>
-      </w:r>
-      <w:r>
-        <w:rPr>
-          <w:rFonts w:ascii="Times New Roman" w:hAnsi="Times New Roman" w:cs="Times New Roman"/>
-        </w:rPr>
-        <w:t xml:space="preserve"> </w:t>
-      </w:r>
-      <w:r>
-        <w:rPr>
-          <w:rFonts w:ascii="Times New Roman" w:hAnsi="Times New Roman" w:cs="Times New Roman"/>
-        </w:rPr>
         <w:t>were</w:t>
       </w:r>
       <w:r>
@@ -1542,13 +1542,7 @@
         <w:rPr>
           <w:rFonts w:ascii="Times New Roman" w:hAnsi="Times New Roman" w:cs="Times New Roman"/>
         </w:rPr>
-        <w:t xml:space="preserve"> </w:t>
-      </w:r>
-      <w:r>
-        <w:rPr>
-          <w:rFonts w:ascii="Times New Roman" w:hAnsi="Times New Roman" w:cs="Times New Roman"/>
-        </w:rPr>
-        <w:t xml:space="preserve">All 4 outcomes were considered equally important and there </w:t>
+        <w:t xml:space="preserve"> All 4 outcomes were considered equally important and there </w:t>
       </w:r>
       <w:r>
         <w:rPr>
@@ -1569,55 +1563,7 @@
         <w:rPr>
           <w:rFonts w:ascii="Times New Roman" w:hAnsi="Times New Roman" w:cs="Times New Roman"/>
         </w:rPr>
-        <w:t>This analysis w</w:t>
-      </w:r>
-      <w:r>
-        <w:rPr>
-          <w:rFonts w:ascii="Times New Roman" w:hAnsi="Times New Roman" w:cs="Times New Roman"/>
-        </w:rPr>
-        <w:t xml:space="preserve">as </w:t>
-      </w:r>
-      <w:r>
-        <w:rPr>
-          <w:rFonts w:ascii="Times New Roman" w:hAnsi="Times New Roman" w:cs="Times New Roman"/>
-        </w:rPr>
-        <w:t xml:space="preserve">repeated in a frequentist framework </w:t>
-      </w:r>
-      <w:r>
-        <w:rPr>
-          <w:rFonts w:ascii="Times New Roman" w:hAnsi="Times New Roman" w:cs="Times New Roman"/>
-        </w:rPr>
-        <w:t xml:space="preserve">by fitting </w:t>
-      </w:r>
-      <w:r>
-        <w:rPr>
-          <w:rFonts w:ascii="Times New Roman" w:hAnsi="Times New Roman" w:cs="Times New Roman"/>
-        </w:rPr>
-        <w:t>separat</w:t>
-      </w:r>
-      <w:r>
-        <w:rPr>
-          <w:rFonts w:ascii="Times New Roman" w:hAnsi="Times New Roman" w:cs="Times New Roman"/>
-        </w:rPr>
-        <w:t xml:space="preserve">e </w:t>
-      </w:r>
-      <w:r>
-        <w:rPr>
-          <w:rFonts w:ascii="Times New Roman" w:hAnsi="Times New Roman" w:cs="Times New Roman"/>
-        </w:rPr>
-        <w:t>linear regression model</w:t>
-      </w:r>
-      <w:r>
-        <w:rPr>
-          <w:rFonts w:ascii="Times New Roman" w:hAnsi="Times New Roman" w:cs="Times New Roman"/>
-        </w:rPr>
-        <w:t>s</w:t>
-      </w:r>
-      <w:r>
-        <w:rPr>
-          <w:rFonts w:ascii="Times New Roman" w:hAnsi="Times New Roman" w:cs="Times New Roman"/>
-        </w:rPr>
-        <w:t xml:space="preserve"> for each </w:t>
+        <w:t xml:space="preserve">This analysis was repeated in a frequentist framework by fitting separate linear regression models for each </w:t>
       </w:r>
       <w:r>
         <w:rPr>
@@ -1653,7 +1599,21 @@
         <w:rPr>
           <w:rFonts w:ascii="Times New Roman" w:hAnsi="Times New Roman" w:cs="Times New Roman"/>
         </w:rPr>
-        <w:t>analysis was not the primary focus on this report.</w:t>
+        <w:t xml:space="preserve">analysis </w:t>
+      </w:r>
+      <w:proofErr w:type="gramStart"/>
+      <w:r>
+        <w:rPr>
+          <w:rFonts w:ascii="Times New Roman" w:hAnsi="Times New Roman" w:cs="Times New Roman"/>
+        </w:rPr>
+        <w:t>was</w:t>
+      </w:r>
+      <w:proofErr w:type="gramEnd"/>
+      <w:r>
+        <w:rPr>
+          <w:rFonts w:ascii="Times New Roman" w:hAnsi="Times New Roman" w:cs="Times New Roman"/>
+        </w:rPr>
+        <w:t xml:space="preserve"> not the primary focus on this report.</w:t>
       </w:r>
     </w:p>
     <w:p>
@@ -1882,7 +1842,35 @@
         <w:rPr>
           <w:rFonts w:ascii="Times New Roman" w:hAnsi="Times New Roman" w:cs="Times New Roman"/>
         </w:rPr>
-        <w:t>From Table 2, based on the crude model, the posterior mean (95% HPDI) of the difference in physical and mental QoL between hard drug users at baseline and non-users is -3.34 (-5.61, -1.06) and -0.28 (-3.18, 2.63) respectively. Compared to non-hard drug users, hard drug users have a lower CD4+ T-cell count with a posterior mean (95% HPDI) of -163.60 (-215.76, -111.58). Finally, the posterior mean of the difference in log10 viral load (copies/mL) between hard drug users and non-users is -0.06 (-0.39, 0.27). There is a 95% probability that hard drug users compared to non-users have a lower aggregate physical QoL score and lower CD4+ T-cell count. Therefore, there is a high level of confidence e(probability) that hard drug use is associated with these responses. The HPDI for aggregate mental QoL score and log10 viral load includes the null value of 0. Therefore, there is a low level of confidence that these response variables are associated with hard drug use. The respect</w:t>
+        <w:t xml:space="preserve">From Table 2, based on the crude model, the posterior </w:t>
+      </w:r>
+      <w:proofErr w:type="gramStart"/>
+      <w:r>
+        <w:rPr>
+          <w:rFonts w:ascii="Times New Roman" w:hAnsi="Times New Roman" w:cs="Times New Roman"/>
+        </w:rPr>
+        <w:t>mean</w:t>
+      </w:r>
+      <w:proofErr w:type="gramEnd"/>
+      <w:r>
+        <w:rPr>
+          <w:rFonts w:ascii="Times New Roman" w:hAnsi="Times New Roman" w:cs="Times New Roman"/>
+        </w:rPr>
+        <w:t xml:space="preserve"> (95% HPDI) of the difference in physical and mental QoL between hard drug users at baseline and non-users is -3.34 (-5.61, -1.06) and -0.28 (-3.18, 2.63) respectively. Compared to non-hard drug users, hard drug users have a lower CD4+ T-cell count with a posterior mean (95% HPDI) of -163.60 (-215.76, -111.58). Finally, the posterior </w:t>
+      </w:r>
+      <w:proofErr w:type="gramStart"/>
+      <w:r>
+        <w:rPr>
+          <w:rFonts w:ascii="Times New Roman" w:hAnsi="Times New Roman" w:cs="Times New Roman"/>
+        </w:rPr>
+        <w:t>mean</w:t>
+      </w:r>
+      <w:proofErr w:type="gramEnd"/>
+      <w:r>
+        <w:rPr>
+          <w:rFonts w:ascii="Times New Roman" w:hAnsi="Times New Roman" w:cs="Times New Roman"/>
+        </w:rPr>
+        <w:t xml:space="preserve"> of the difference in log10 viral load (copies/mL) between hard drug users and non-users is -0.06 (-0.39, 0.27). There is a 95% probability that hard drug users compared to non-users have a lower aggregate physical QoL score and lower CD4+ T-cell count. Therefore, there is a high level of confidence e(probability) that hard drug use is associated with these responses. The HPDI for aggregate mental QoL score and log10 viral load includes the null value of 0. Therefore, there is a low level of confidence that these response variables are associated with hard drug use. The respect</w:t>
       </w:r>
       <w:r>
         <w:rPr>
@@ -1941,7 +1929,25 @@
           <w:rFonts w:ascii="Times New Roman" w:hAnsi="Times New Roman" w:cs="Times New Roman"/>
         </w:rPr>
         <w:lastRenderedPageBreak/>
-        <w:t>23.8% for log10 viral load. The</w:t>
+        <w:t>1</w:t>
+      </w:r>
+      <w:r>
+        <w:rPr>
+          <w:rFonts w:ascii="Times New Roman" w:hAnsi="Times New Roman" w:cs="Times New Roman"/>
+        </w:rPr>
+        <w:t>.8</w:t>
+      </w:r>
+      <w:r>
+        <w:rPr>
+          <w:rFonts w:ascii="Times New Roman" w:hAnsi="Times New Roman" w:cs="Times New Roman"/>
+        </w:rPr>
+        <w:t>0</w:t>
+      </w:r>
+      <w:r>
+        <w:rPr>
+          <w:rFonts w:ascii="Times New Roman" w:hAnsi="Times New Roman" w:cs="Times New Roman"/>
+        </w:rPr>
+        <w:t>% for log10 viral load. The</w:t>
       </w:r>
       <w:r>
         <w:rPr>
@@ -2073,19 +2079,7 @@
         <w:rPr>
           <w:rFonts w:ascii="Times New Roman" w:hAnsi="Times New Roman" w:cs="Times New Roman"/>
         </w:rPr>
-        <w:t xml:space="preserve">limitation is the subject dropout (lost to follow-up), 29% of subjects were lost between baseline and year 2, and a higher proportion of dropout happened among the hard drug users at baseline. Also, there is evidence of a slight difference in the characteristics of the subjects that remained </w:t>
-      </w:r>
-      <w:r>
-        <w:rPr>
-          <w:rFonts w:ascii="Times New Roman" w:hAnsi="Times New Roman" w:cs="Times New Roman"/>
-        </w:rPr>
-        <w:t>in</w:t>
-      </w:r>
-      <w:r>
-        <w:rPr>
-          <w:rFonts w:ascii="Times New Roman" w:hAnsi="Times New Roman" w:cs="Times New Roman"/>
-        </w:rPr>
-        <w:t xml:space="preserve"> study compared to those that started the study.</w:t>
+        <w:t>limitation is the subject dropout (lost to follow-up), 29% of subjects were lost between baseline and year 2, and a higher proportion of dropout happened among the hard drug users at baseline. Also, there is evidence of a slight difference in the characteristics of the subjects that remained in study compared to those that started the study.</w:t>
       </w:r>
       <w:r>
         <w:rPr>
@@ -2183,7 +2177,6 @@
               <w:rPr>
                 <w:rFonts w:ascii="Times New Roman" w:hAnsi="Times New Roman" w:cs="Times New Roman"/>
                 <w:b/>
-                <w:sz w:val="20"/>
               </w:rPr>
               <w:t>Hard Drug use at Baseline?</w:t>
             </w:r>
@@ -2250,7 +2243,6 @@
               <w:rPr>
                 <w:rFonts w:ascii="Times New Roman" w:hAnsi="Times New Roman" w:cs="Times New Roman"/>
                 <w:b/>
-                <w:sz w:val="20"/>
               </w:rPr>
               <w:t>Subject Characteristics</w:t>
             </w:r>
@@ -2277,14 +2269,12 @@
               <w:rPr>
                 <w:rFonts w:ascii="Times New Roman" w:hAnsi="Times New Roman" w:cs="Times New Roman"/>
                 <w:b/>
-                <w:sz w:val="20"/>
               </w:rPr>
               <w:t>No</w:t>
             </w:r>
             <w:r>
               <w:rPr>
                 <w:rFonts w:ascii="Times New Roman" w:hAnsi="Times New Roman" w:cs="Times New Roman"/>
-                <w:sz w:val="20"/>
               </w:rPr>
               <w:t xml:space="preserve"> N = 427</w:t>
             </w:r>
@@ -2292,7 +2282,6 @@
               <w:rPr>
                 <w:rFonts w:ascii="Times New Roman" w:hAnsi="Times New Roman" w:cs="Times New Roman"/>
                 <w:i/>
-                <w:sz w:val="20"/>
                 <w:vertAlign w:val="superscript"/>
               </w:rPr>
               <w:t>1</w:t>
@@ -2320,14 +2309,12 @@
               <w:rPr>
                 <w:rFonts w:ascii="Times New Roman" w:hAnsi="Times New Roman" w:cs="Times New Roman"/>
                 <w:b/>
-                <w:sz w:val="20"/>
               </w:rPr>
               <w:t>Yes</w:t>
             </w:r>
             <w:r>
               <w:rPr>
                 <w:rFonts w:ascii="Times New Roman" w:hAnsi="Times New Roman" w:cs="Times New Roman"/>
-                <w:sz w:val="20"/>
               </w:rPr>
               <w:t xml:space="preserve"> N = 36</w:t>
             </w:r>
@@ -2335,7 +2322,6 @@
               <w:rPr>
                 <w:rFonts w:ascii="Times New Roman" w:hAnsi="Times New Roman" w:cs="Times New Roman"/>
                 <w:i/>
-                <w:sz w:val="20"/>
                 <w:vertAlign w:val="superscript"/>
               </w:rPr>
               <w:t>1</w:t>
@@ -2363,7 +2349,6 @@
               <w:rPr>
                 <w:rFonts w:ascii="Times New Roman" w:hAnsi="Times New Roman" w:cs="Times New Roman"/>
                 <w:b/>
-                <w:sz w:val="20"/>
               </w:rPr>
               <w:t>p-value</w:t>
             </w:r>
@@ -2371,7 +2356,6 @@
               <w:rPr>
                 <w:rFonts w:ascii="Times New Roman" w:hAnsi="Times New Roman" w:cs="Times New Roman"/>
                 <w:i/>
-                <w:sz w:val="20"/>
                 <w:vertAlign w:val="superscript"/>
               </w:rPr>
               <w:t>2</w:t>
@@ -2399,14 +2383,12 @@
               <w:rPr>
                 <w:rFonts w:ascii="Times New Roman" w:hAnsi="Times New Roman" w:cs="Times New Roman"/>
                 <w:b/>
-                <w:sz w:val="20"/>
               </w:rPr>
               <w:t>Overall</w:t>
             </w:r>
             <w:r>
               <w:rPr>
                 <w:rFonts w:ascii="Times New Roman" w:hAnsi="Times New Roman" w:cs="Times New Roman"/>
-                <w:sz w:val="20"/>
               </w:rPr>
               <w:t xml:space="preserve"> N = 463</w:t>
             </w:r>
@@ -2414,7 +2396,6 @@
               <w:rPr>
                 <w:rFonts w:ascii="Times New Roman" w:hAnsi="Times New Roman" w:cs="Times New Roman"/>
                 <w:i/>
-                <w:sz w:val="20"/>
                 <w:vertAlign w:val="superscript"/>
               </w:rPr>
               <w:t>1</w:t>
@@ -2445,7 +2426,6 @@
             <w:r>
               <w:rPr>
                 <w:rFonts w:ascii="Times New Roman" w:hAnsi="Times New Roman" w:cs="Times New Roman"/>
-                <w:sz w:val="20"/>
               </w:rPr>
               <w:t>Age at visit (years)</w:t>
             </w:r>
@@ -2470,7 +2450,6 @@
             <w:r>
               <w:rPr>
                 <w:rFonts w:ascii="Times New Roman" w:hAnsi="Times New Roman" w:cs="Times New Roman"/>
-                <w:sz w:val="20"/>
               </w:rPr>
               <w:t>43.1 (8.7)</w:t>
             </w:r>
@@ -2495,7 +2474,6 @@
             <w:r>
               <w:rPr>
                 <w:rFonts w:ascii="Times New Roman" w:hAnsi="Times New Roman" w:cs="Times New Roman"/>
-                <w:sz w:val="20"/>
               </w:rPr>
               <w:t>43.9 (9.5)</w:t>
             </w:r>
@@ -2520,7 +2498,6 @@
             <w:r>
               <w:rPr>
                 <w:rFonts w:ascii="Times New Roman" w:hAnsi="Times New Roman" w:cs="Times New Roman"/>
-                <w:sz w:val="20"/>
               </w:rPr>
               <w:t>0.621</w:t>
             </w:r>
@@ -2545,7 +2522,6 @@
             <w:r>
               <w:rPr>
                 <w:rFonts w:ascii="Times New Roman" w:hAnsi="Times New Roman" w:cs="Times New Roman"/>
-                <w:sz w:val="20"/>
               </w:rPr>
               <w:t>43.2 (8.7)</w:t>
             </w:r>
@@ -2572,7 +2548,6 @@
             <w:r>
               <w:rPr>
                 <w:rFonts w:ascii="Times New Roman" w:hAnsi="Times New Roman" w:cs="Times New Roman"/>
-                <w:sz w:val="20"/>
               </w:rPr>
               <w:t>Body Mass Index (kg/m^2)</w:t>
             </w:r>
@@ -2594,7 +2569,6 @@
             <w:r>
               <w:rPr>
                 <w:rFonts w:ascii="Times New Roman" w:hAnsi="Times New Roman" w:cs="Times New Roman"/>
-                <w:sz w:val="20"/>
               </w:rPr>
               <w:t>25.3 (4.4)</w:t>
             </w:r>
@@ -2616,7 +2590,6 @@
             <w:r>
               <w:rPr>
                 <w:rFonts w:ascii="Times New Roman" w:hAnsi="Times New Roman" w:cs="Times New Roman"/>
-                <w:sz w:val="20"/>
               </w:rPr>
               <w:t>23.6 (3.4)</w:t>
             </w:r>
@@ -2638,7 +2611,6 @@
             <w:r>
               <w:rPr>
                 <w:rFonts w:ascii="Times New Roman" w:hAnsi="Times New Roman" w:cs="Times New Roman"/>
-                <w:sz w:val="20"/>
               </w:rPr>
               <w:t>0.013</w:t>
             </w:r>
@@ -2660,7 +2632,6 @@
             <w:r>
               <w:rPr>
                 <w:rFonts w:ascii="Times New Roman" w:hAnsi="Times New Roman" w:cs="Times New Roman"/>
-                <w:sz w:val="20"/>
               </w:rPr>
               <w:t>25.2 (4.3)</w:t>
             </w:r>
@@ -2687,7 +2658,6 @@
             <w:r>
               <w:rPr>
                 <w:rFonts w:ascii="Times New Roman" w:hAnsi="Times New Roman" w:cs="Times New Roman"/>
-                <w:sz w:val="20"/>
               </w:rPr>
               <w:t>Race/ethnicity</w:t>
             </w:r>
@@ -2739,7 +2709,6 @@
             <w:r>
               <w:rPr>
                 <w:rFonts w:ascii="Times New Roman" w:hAnsi="Times New Roman" w:cs="Times New Roman"/>
-                <w:sz w:val="20"/>
               </w:rPr>
               <w:t>0.147</w:t>
             </w:r>
@@ -2781,7 +2750,6 @@
             <w:r>
               <w:rPr>
                 <w:rFonts w:ascii="Times New Roman" w:hAnsi="Times New Roman" w:cs="Times New Roman"/>
-                <w:sz w:val="20"/>
               </w:rPr>
               <w:t>    Other</w:t>
             </w:r>
@@ -2803,7 +2771,6 @@
             <w:r>
               <w:rPr>
                 <w:rFonts w:ascii="Times New Roman" w:hAnsi="Times New Roman" w:cs="Times New Roman"/>
-                <w:sz w:val="20"/>
               </w:rPr>
               <w:t>150 (35%)</w:t>
             </w:r>
@@ -2825,7 +2792,6 @@
             <w:r>
               <w:rPr>
                 <w:rFonts w:ascii="Times New Roman" w:hAnsi="Times New Roman" w:cs="Times New Roman"/>
-                <w:sz w:val="20"/>
               </w:rPr>
               <w:t>17 (47%)</w:t>
             </w:r>
@@ -2862,7 +2828,6 @@
             <w:r>
               <w:rPr>
                 <w:rFonts w:ascii="Times New Roman" w:hAnsi="Times New Roman" w:cs="Times New Roman"/>
-                <w:sz w:val="20"/>
               </w:rPr>
               <w:t>167 (36%)</w:t>
             </w:r>
@@ -2889,7 +2854,6 @@
             <w:r>
               <w:rPr>
                 <w:rFonts w:ascii="Times New Roman" w:hAnsi="Times New Roman" w:cs="Times New Roman"/>
-                <w:sz w:val="20"/>
               </w:rPr>
               <w:t>    White, non-Hispanic</w:t>
             </w:r>
@@ -2911,7 +2875,6 @@
             <w:r>
               <w:rPr>
                 <w:rFonts w:ascii="Times New Roman" w:hAnsi="Times New Roman" w:cs="Times New Roman"/>
-                <w:sz w:val="20"/>
               </w:rPr>
               <w:t>277 (65%)</w:t>
             </w:r>
@@ -2933,7 +2896,6 @@
             <w:r>
               <w:rPr>
                 <w:rFonts w:ascii="Times New Roman" w:hAnsi="Times New Roman" w:cs="Times New Roman"/>
-                <w:sz w:val="20"/>
               </w:rPr>
               <w:t>19 (53%)</w:t>
             </w:r>
@@ -2970,7 +2932,6 @@
             <w:r>
               <w:rPr>
                 <w:rFonts w:ascii="Times New Roman" w:hAnsi="Times New Roman" w:cs="Times New Roman"/>
-                <w:sz w:val="20"/>
               </w:rPr>
               <w:t>296 (64%)</w:t>
             </w:r>
@@ -2997,7 +2958,6 @@
             <w:r>
               <w:rPr>
                 <w:rFonts w:ascii="Times New Roman" w:hAnsi="Times New Roman" w:cs="Times New Roman"/>
-                <w:sz w:val="20"/>
               </w:rPr>
               <w:t>Highest level of education</w:t>
             </w:r>
@@ -3049,7 +3009,6 @@
             <w:r>
               <w:rPr>
                 <w:rFonts w:ascii="Times New Roman" w:hAnsi="Times New Roman" w:cs="Times New Roman"/>
-                <w:sz w:val="20"/>
               </w:rPr>
               <w:t>0.049</w:t>
             </w:r>
@@ -3091,7 +3050,6 @@
             <w:r>
               <w:rPr>
                 <w:rFonts w:ascii="Times New Roman" w:hAnsi="Times New Roman" w:cs="Times New Roman"/>
-                <w:sz w:val="20"/>
               </w:rPr>
               <w:t>    Below four years college</w:t>
             </w:r>
@@ -3113,7 +3071,6 @@
             <w:r>
               <w:rPr>
                 <w:rFonts w:ascii="Times New Roman" w:hAnsi="Times New Roman" w:cs="Times New Roman"/>
-                <w:sz w:val="20"/>
               </w:rPr>
               <w:t>236 (55%)</w:t>
             </w:r>
@@ -3135,7 +3092,6 @@
             <w:r>
               <w:rPr>
                 <w:rFonts w:ascii="Times New Roman" w:hAnsi="Times New Roman" w:cs="Times New Roman"/>
-                <w:sz w:val="20"/>
               </w:rPr>
               <w:t>26 (72%)</w:t>
             </w:r>
@@ -3172,7 +3128,6 @@
             <w:r>
               <w:rPr>
                 <w:rFonts w:ascii="Times New Roman" w:hAnsi="Times New Roman" w:cs="Times New Roman"/>
-                <w:sz w:val="20"/>
               </w:rPr>
               <w:t>262 (57%)</w:t>
             </w:r>
@@ -3199,7 +3154,6 @@
             <w:r>
               <w:rPr>
                 <w:rFonts w:ascii="Times New Roman" w:hAnsi="Times New Roman" w:cs="Times New Roman"/>
-                <w:sz w:val="20"/>
               </w:rPr>
               <w:t>    Four years of college or higher</w:t>
             </w:r>
@@ -3221,7 +3175,6 @@
             <w:r>
               <w:rPr>
                 <w:rFonts w:ascii="Times New Roman" w:hAnsi="Times New Roman" w:cs="Times New Roman"/>
-                <w:sz w:val="20"/>
               </w:rPr>
               <w:t>191 (45%)</w:t>
             </w:r>
@@ -3243,7 +3196,6 @@
             <w:r>
               <w:rPr>
                 <w:rFonts w:ascii="Times New Roman" w:hAnsi="Times New Roman" w:cs="Times New Roman"/>
-                <w:sz w:val="20"/>
               </w:rPr>
               <w:t>10 (28%)</w:t>
             </w:r>
@@ -3280,7 +3232,6 @@
             <w:r>
               <w:rPr>
                 <w:rFonts w:ascii="Times New Roman" w:hAnsi="Times New Roman" w:cs="Times New Roman"/>
-                <w:sz w:val="20"/>
               </w:rPr>
               <w:t>201 (43%)</w:t>
             </w:r>
@@ -3307,7 +3258,6 @@
             <w:r>
               <w:rPr>
                 <w:rFonts w:ascii="Times New Roman" w:hAnsi="Times New Roman" w:cs="Times New Roman"/>
-                <w:sz w:val="20"/>
               </w:rPr>
               <w:t>Smoking status</w:t>
             </w:r>
@@ -3359,7 +3309,6 @@
             <w:r>
               <w:rPr>
                 <w:rFonts w:ascii="Times New Roman" w:hAnsi="Times New Roman" w:cs="Times New Roman"/>
-                <w:sz w:val="20"/>
               </w:rPr>
               <w:t>&lt;0.001</w:t>
             </w:r>
@@ -3401,7 +3350,6 @@
             <w:r>
               <w:rPr>
                 <w:rFonts w:ascii="Times New Roman" w:hAnsi="Times New Roman" w:cs="Times New Roman"/>
-                <w:sz w:val="20"/>
               </w:rPr>
               <w:t>    Former/never smoker</w:t>
             </w:r>
@@ -3423,7 +3371,6 @@
             <w:r>
               <w:rPr>
                 <w:rFonts w:ascii="Times New Roman" w:hAnsi="Times New Roman" w:cs="Times New Roman"/>
-                <w:sz w:val="20"/>
               </w:rPr>
               <w:t>278 (65%)</w:t>
             </w:r>
@@ -3445,7 +3392,6 @@
             <w:r>
               <w:rPr>
                 <w:rFonts w:ascii="Times New Roman" w:hAnsi="Times New Roman" w:cs="Times New Roman"/>
-                <w:sz w:val="20"/>
               </w:rPr>
               <w:t>9 (25%)</w:t>
             </w:r>
@@ -3482,7 +3428,6 @@
             <w:r>
               <w:rPr>
                 <w:rFonts w:ascii="Times New Roman" w:hAnsi="Times New Roman" w:cs="Times New Roman"/>
-                <w:sz w:val="20"/>
               </w:rPr>
               <w:t>287 (62%)</w:t>
             </w:r>
@@ -3509,7 +3454,6 @@
             <w:r>
               <w:rPr>
                 <w:rFonts w:ascii="Times New Roman" w:hAnsi="Times New Roman" w:cs="Times New Roman"/>
-                <w:sz w:val="20"/>
               </w:rPr>
               <w:t>    Current smoker</w:t>
             </w:r>
@@ -3531,7 +3475,6 @@
             <w:r>
               <w:rPr>
                 <w:rFonts w:ascii="Times New Roman" w:hAnsi="Times New Roman" w:cs="Times New Roman"/>
-                <w:sz w:val="20"/>
               </w:rPr>
               <w:t>149 (35%)</w:t>
             </w:r>
@@ -3553,7 +3496,6 @@
             <w:r>
               <w:rPr>
                 <w:rFonts w:ascii="Times New Roman" w:hAnsi="Times New Roman" w:cs="Times New Roman"/>
-                <w:sz w:val="20"/>
               </w:rPr>
               <w:t>27 (75%)</w:t>
             </w:r>
@@ -3590,7 +3532,6 @@
             <w:r>
               <w:rPr>
                 <w:rFonts w:ascii="Times New Roman" w:hAnsi="Times New Roman" w:cs="Times New Roman"/>
-                <w:sz w:val="20"/>
               </w:rPr>
               <w:t>176 (38%)</w:t>
             </w:r>
@@ -3617,7 +3558,6 @@
             <w:r>
               <w:rPr>
                 <w:rFonts w:ascii="Times New Roman" w:hAnsi="Times New Roman" w:cs="Times New Roman"/>
-                <w:sz w:val="20"/>
               </w:rPr>
               <w:t>Baseline: Aggregate physical QoL score</w:t>
             </w:r>
@@ -3639,7 +3579,6 @@
             <w:r>
               <w:rPr>
                 <w:rFonts w:ascii="Times New Roman" w:hAnsi="Times New Roman" w:cs="Times New Roman"/>
-                <w:sz w:val="20"/>
               </w:rPr>
               <w:t>51.4 (9.0)</w:t>
             </w:r>
@@ -3661,7 +3600,6 @@
             <w:r>
               <w:rPr>
                 <w:rFonts w:ascii="Times New Roman" w:hAnsi="Times New Roman" w:cs="Times New Roman"/>
-                <w:sz w:val="20"/>
               </w:rPr>
               <w:t>49.2 (7.1)</w:t>
             </w:r>
@@ -3683,7 +3621,6 @@
             <w:r>
               <w:rPr>
                 <w:rFonts w:ascii="Times New Roman" w:hAnsi="Times New Roman" w:cs="Times New Roman"/>
-                <w:sz w:val="20"/>
               </w:rPr>
               <w:t>0.032</w:t>
             </w:r>
@@ -3705,7 +3642,6 @@
             <w:r>
               <w:rPr>
                 <w:rFonts w:ascii="Times New Roman" w:hAnsi="Times New Roman" w:cs="Times New Roman"/>
-                <w:sz w:val="20"/>
               </w:rPr>
               <w:t>51.2 (8.9)</w:t>
             </w:r>
@@ -3732,7 +3668,6 @@
             <w:r>
               <w:rPr>
                 <w:rFonts w:ascii="Times New Roman" w:hAnsi="Times New Roman" w:cs="Times New Roman"/>
-                <w:sz w:val="20"/>
               </w:rPr>
               <w:t>Baseline: Aggregate mental QoL score</w:t>
             </w:r>
@@ -3754,7 +3689,6 @@
             <w:r>
               <w:rPr>
                 <w:rFonts w:ascii="Times New Roman" w:hAnsi="Times New Roman" w:cs="Times New Roman"/>
-                <w:sz w:val="20"/>
               </w:rPr>
               <w:t>45.2 (13.8)</w:t>
             </w:r>
@@ -3776,7 +3710,6 @@
             <w:r>
               <w:rPr>
                 <w:rFonts w:ascii="Times New Roman" w:hAnsi="Times New Roman" w:cs="Times New Roman"/>
-                <w:sz w:val="20"/>
               </w:rPr>
               <w:t>42.0 (11.6)</w:t>
             </w:r>
@@ -3798,7 +3731,6 @@
             <w:r>
               <w:rPr>
                 <w:rFonts w:ascii="Times New Roman" w:hAnsi="Times New Roman" w:cs="Times New Roman"/>
-                <w:sz w:val="20"/>
               </w:rPr>
               <w:t>0.068</w:t>
             </w:r>
@@ -3820,7 +3752,6 @@
             <w:r>
               <w:rPr>
                 <w:rFonts w:ascii="Times New Roman" w:hAnsi="Times New Roman" w:cs="Times New Roman"/>
-                <w:sz w:val="20"/>
               </w:rPr>
               <w:t>44.9 (13.6)</w:t>
             </w:r>
@@ -3847,7 +3778,6 @@
             <w:r>
               <w:rPr>
                 <w:rFonts w:ascii="Times New Roman" w:hAnsi="Times New Roman" w:cs="Times New Roman"/>
-                <w:sz w:val="20"/>
               </w:rPr>
               <w:t>Baseline: CD4+ T cell count</w:t>
             </w:r>
@@ -3869,7 +3799,6 @@
             <w:r>
               <w:rPr>
                 <w:rFonts w:ascii="Times New Roman" w:hAnsi="Times New Roman" w:cs="Times New Roman"/>
-                <w:sz w:val="20"/>
               </w:rPr>
               <w:t>374.5 (202.3)</w:t>
             </w:r>
@@ -3891,7 +3820,6 @@
             <w:r>
               <w:rPr>
                 <w:rFonts w:ascii="Times New Roman" w:hAnsi="Times New Roman" w:cs="Times New Roman"/>
-                <w:sz w:val="20"/>
               </w:rPr>
               <w:t>360.0 (200.8)</w:t>
             </w:r>
@@ -3913,7 +3841,6 @@
             <w:r>
               <w:rPr>
                 <w:rFonts w:ascii="Times New Roman" w:hAnsi="Times New Roman" w:cs="Times New Roman"/>
-                <w:sz w:val="20"/>
               </w:rPr>
               <w:t>0.918</w:t>
             </w:r>
@@ -3935,7 +3862,6 @@
             <w:r>
               <w:rPr>
                 <w:rFonts w:ascii="Times New Roman" w:hAnsi="Times New Roman" w:cs="Times New Roman"/>
-                <w:sz w:val="20"/>
               </w:rPr>
               <w:t>373.3 (202.0)</w:t>
             </w:r>
@@ -3962,7 +3888,6 @@
             <w:r>
               <w:rPr>
                 <w:rFonts w:ascii="Times New Roman" w:hAnsi="Times New Roman" w:cs="Times New Roman"/>
-                <w:sz w:val="20"/>
               </w:rPr>
               <w:t>Baseline: Log10 viral Load (HIV copies per mL of blood)</w:t>
             </w:r>
@@ -3984,7 +3909,6 @@
             <w:r>
               <w:rPr>
                 <w:rFonts w:ascii="Times New Roman" w:hAnsi="Times New Roman" w:cs="Times New Roman"/>
-                <w:sz w:val="20"/>
               </w:rPr>
               <w:t>4.5 (0.9)</w:t>
             </w:r>
@@ -4006,7 +3930,6 @@
             <w:r>
               <w:rPr>
                 <w:rFonts w:ascii="Times New Roman" w:hAnsi="Times New Roman" w:cs="Times New Roman"/>
-                <w:sz w:val="20"/>
               </w:rPr>
               <w:t>4.6 (0.9)</w:t>
             </w:r>
@@ -4028,7 +3951,6 @@
             <w:r>
               <w:rPr>
                 <w:rFonts w:ascii="Times New Roman" w:hAnsi="Times New Roman" w:cs="Times New Roman"/>
-                <w:sz w:val="20"/>
               </w:rPr>
               <w:t>0.879</w:t>
             </w:r>
@@ -4050,7 +3972,6 @@
             <w:r>
               <w:rPr>
                 <w:rFonts w:ascii="Times New Roman" w:hAnsi="Times New Roman" w:cs="Times New Roman"/>
-                <w:sz w:val="20"/>
               </w:rPr>
               <w:t>4.5 (0.9)</w:t>
             </w:r>
@@ -4077,7 +3998,6 @@
             <w:r>
               <w:rPr>
                 <w:rFonts w:ascii="Times New Roman" w:hAnsi="Times New Roman" w:cs="Times New Roman"/>
-                <w:sz w:val="20"/>
               </w:rPr>
               <w:t>Year 2: Aggregate physical QoL score</w:t>
             </w:r>
@@ -4099,7 +4019,6 @@
             <w:r>
               <w:rPr>
                 <w:rFonts w:ascii="Times New Roman" w:hAnsi="Times New Roman" w:cs="Times New Roman"/>
-                <w:sz w:val="20"/>
               </w:rPr>
               <w:t>50.0 (9.9)</w:t>
             </w:r>
@@ -4121,7 +4040,6 @@
             <w:r>
               <w:rPr>
                 <w:rFonts w:ascii="Times New Roman" w:hAnsi="Times New Roman" w:cs="Times New Roman"/>
-                <w:sz w:val="20"/>
               </w:rPr>
               <w:t>44.4 (12.0)</w:t>
             </w:r>
@@ -4143,7 +4061,6 @@
             <w:r>
               <w:rPr>
                 <w:rFonts w:ascii="Times New Roman" w:hAnsi="Times New Roman" w:cs="Times New Roman"/>
-                <w:sz w:val="20"/>
               </w:rPr>
               <w:t>0.001</w:t>
             </w:r>
@@ -4165,7 +4082,6 @@
             <w:r>
               <w:rPr>
                 <w:rFonts w:ascii="Times New Roman" w:hAnsi="Times New Roman" w:cs="Times New Roman"/>
-                <w:sz w:val="20"/>
               </w:rPr>
               <w:t>49.6 (10.2)</w:t>
             </w:r>
@@ -4192,7 +4108,6 @@
             <w:r>
               <w:rPr>
                 <w:rFonts w:ascii="Times New Roman" w:hAnsi="Times New Roman" w:cs="Times New Roman"/>
-                <w:sz w:val="20"/>
               </w:rPr>
               <w:t>Year 2: Aggregate mental QoL score</w:t>
             </w:r>
@@ -4214,7 +4129,6 @@
             <w:r>
               <w:rPr>
                 <w:rFonts w:ascii="Times New Roman" w:hAnsi="Times New Roman" w:cs="Times New Roman"/>
-                <w:sz w:val="20"/>
               </w:rPr>
               <w:t>47.6 (11.8)</w:t>
             </w:r>
@@ -4236,7 +4150,6 @@
             <w:r>
               <w:rPr>
                 <w:rFonts w:ascii="Times New Roman" w:hAnsi="Times New Roman" w:cs="Times New Roman"/>
-                <w:sz w:val="20"/>
               </w:rPr>
               <w:t>45.9 (14.1)</w:t>
             </w:r>
@@ -4258,7 +4171,6 @@
             <w:r>
               <w:rPr>
                 <w:rFonts w:ascii="Times New Roman" w:hAnsi="Times New Roman" w:cs="Times New Roman"/>
-                <w:sz w:val="20"/>
               </w:rPr>
               <w:t>0.858</w:t>
             </w:r>
@@ -4280,7 +4192,6 @@
             <w:r>
               <w:rPr>
                 <w:rFonts w:ascii="Times New Roman" w:hAnsi="Times New Roman" w:cs="Times New Roman"/>
-                <w:sz w:val="20"/>
               </w:rPr>
               <w:t>47.4 (12.0)</w:t>
             </w:r>
@@ -4307,7 +4218,6 @@
             <w:r>
               <w:rPr>
                 <w:rFonts w:ascii="Times New Roman" w:hAnsi="Times New Roman" w:cs="Times New Roman"/>
-                <w:sz w:val="20"/>
               </w:rPr>
               <w:t>Year 2: CD4+ T cell count</w:t>
             </w:r>
@@ -4329,7 +4239,6 @@
             <w:r>
               <w:rPr>
                 <w:rFonts w:ascii="Times New Roman" w:hAnsi="Times New Roman" w:cs="Times New Roman"/>
-                <w:sz w:val="20"/>
               </w:rPr>
               <w:t>556.1 (264.1)</w:t>
             </w:r>
@@ -4351,7 +4260,6 @@
             <w:r>
               <w:rPr>
                 <w:rFonts w:ascii="Times New Roman" w:hAnsi="Times New Roman" w:cs="Times New Roman"/>
-                <w:sz w:val="20"/>
               </w:rPr>
               <w:t>371.2 (248.8)</w:t>
             </w:r>
@@ -4373,7 +4281,6 @@
             <w:r>
               <w:rPr>
                 <w:rFonts w:ascii="Times New Roman" w:hAnsi="Times New Roman" w:cs="Times New Roman"/>
-                <w:sz w:val="20"/>
               </w:rPr>
               <w:t>&lt;0.001</w:t>
             </w:r>
@@ -4395,7 +4302,6 @@
             <w:r>
               <w:rPr>
                 <w:rFonts w:ascii="Times New Roman" w:hAnsi="Times New Roman" w:cs="Times New Roman"/>
-                <w:sz w:val="20"/>
               </w:rPr>
               <w:t>541.7 (267.3)</w:t>
             </w:r>
@@ -4422,7 +4328,6 @@
             <w:r>
               <w:rPr>
                 <w:rFonts w:ascii="Times New Roman" w:hAnsi="Times New Roman" w:cs="Times New Roman"/>
-                <w:sz w:val="20"/>
               </w:rPr>
               <w:t>Year 2: Log10 viral Load (HIV copies per mL of blood)</w:t>
             </w:r>
@@ -4444,7 +4349,6 @@
             <w:r>
               <w:rPr>
                 <w:rFonts w:ascii="Times New Roman" w:hAnsi="Times New Roman" w:cs="Times New Roman"/>
-                <w:sz w:val="20"/>
               </w:rPr>
               <w:t>1.8 (1.2)</w:t>
             </w:r>
@@ -4466,7 +4370,6 @@
             <w:r>
               <w:rPr>
                 <w:rFonts w:ascii="Times New Roman" w:hAnsi="Times New Roman" w:cs="Times New Roman"/>
-                <w:sz w:val="20"/>
               </w:rPr>
               <w:t>1.9 (1.5)</w:t>
             </w:r>
@@ -4488,7 +4391,6 @@
             <w:r>
               <w:rPr>
                 <w:rFonts w:ascii="Times New Roman" w:hAnsi="Times New Roman" w:cs="Times New Roman"/>
-                <w:sz w:val="20"/>
               </w:rPr>
               <w:t>0.798</w:t>
             </w:r>
@@ -4510,7 +4412,6 @@
             <w:r>
               <w:rPr>
                 <w:rFonts w:ascii="Times New Roman" w:hAnsi="Times New Roman" w:cs="Times New Roman"/>
-                <w:sz w:val="20"/>
               </w:rPr>
               <w:t>1.8 (1.2)</w:t>
             </w:r>
@@ -4537,7 +4438,6 @@
             <w:r>
               <w:rPr>
                 <w:rFonts w:ascii="Times New Roman" w:hAnsi="Times New Roman" w:cs="Times New Roman"/>
-                <w:sz w:val="20"/>
               </w:rPr>
               <w:t>Year 2: Adherence to meds taken since last visit</w:t>
             </w:r>
@@ -4589,7 +4489,6 @@
             <w:r>
               <w:rPr>
                 <w:rFonts w:ascii="Times New Roman" w:hAnsi="Times New Roman" w:cs="Times New Roman"/>
-                <w:sz w:val="20"/>
               </w:rPr>
               <w:t>0.239</w:t>
             </w:r>
@@ -4634,7 +4533,6 @@
             <w:r>
               <w:rPr>
                 <w:rFonts w:ascii="Times New Roman" w:hAnsi="Times New Roman" w:cs="Times New Roman"/>
-                <w:sz w:val="20"/>
               </w:rPr>
               <w:t>    &lt;95%</w:t>
             </w:r>
@@ -4659,7 +4557,6 @@
             <w:r>
               <w:rPr>
                 <w:rFonts w:ascii="Times New Roman" w:hAnsi="Times New Roman" w:cs="Times New Roman"/>
-                <w:sz w:val="20"/>
               </w:rPr>
               <w:t>45 (11%)</w:t>
             </w:r>
@@ -4684,7 +4581,6 @@
             <w:r>
               <w:rPr>
                 <w:rFonts w:ascii="Times New Roman" w:hAnsi="Times New Roman" w:cs="Times New Roman"/>
-                <w:sz w:val="20"/>
               </w:rPr>
               <w:t>1 (3%)</w:t>
             </w:r>
@@ -4727,7 +4623,6 @@
             <w:r>
               <w:rPr>
                 <w:rFonts w:ascii="Times New Roman" w:hAnsi="Times New Roman" w:cs="Times New Roman"/>
-                <w:sz w:val="20"/>
               </w:rPr>
               <w:t>46 (10%)</w:t>
             </w:r>
@@ -4758,7 +4653,6 @@
             <w:r>
               <w:rPr>
                 <w:rFonts w:ascii="Times New Roman" w:hAnsi="Times New Roman" w:cs="Times New Roman"/>
-                <w:sz w:val="20"/>
               </w:rPr>
               <w:t>    &gt;=95%</w:t>
             </w:r>
@@ -4784,7 +4678,6 @@
             <w:r>
               <w:rPr>
                 <w:rFonts w:ascii="Times New Roman" w:hAnsi="Times New Roman" w:cs="Times New Roman"/>
-                <w:sz w:val="20"/>
               </w:rPr>
               <w:t>382 (89%)</w:t>
             </w:r>
@@ -4810,7 +4703,6 @@
             <w:r>
               <w:rPr>
                 <w:rFonts w:ascii="Times New Roman" w:hAnsi="Times New Roman" w:cs="Times New Roman"/>
-                <w:sz w:val="20"/>
               </w:rPr>
               <w:t>35 (97%)</w:t>
             </w:r>
@@ -4855,7 +4747,6 @@
             <w:r>
               <w:rPr>
                 <w:rFonts w:ascii="Times New Roman" w:hAnsi="Times New Roman" w:cs="Times New Roman"/>
-                <w:sz w:val="20"/>
               </w:rPr>
               <w:t>417 (90%)</w:t>
             </w:r>
@@ -4887,7 +4778,6 @@
               <w:rPr>
                 <w:rFonts w:ascii="Times New Roman" w:hAnsi="Times New Roman" w:cs="Times New Roman"/>
                 <w:i/>
-                <w:sz w:val="20"/>
                 <w:vertAlign w:val="superscript"/>
               </w:rPr>
               <w:t>1</w:t>
@@ -4895,7 +4785,6 @@
             <w:r>
               <w:rPr>
                 <w:rFonts w:ascii="Times New Roman" w:hAnsi="Times New Roman" w:cs="Times New Roman"/>
-                <w:sz w:val="20"/>
               </w:rPr>
               <w:t>Mean (SD); n (%)</w:t>
             </w:r>
@@ -4924,7 +4813,6 @@
               <w:rPr>
                 <w:rFonts w:ascii="Times New Roman" w:hAnsi="Times New Roman" w:cs="Times New Roman"/>
                 <w:i/>
-                <w:sz w:val="20"/>
                 <w:vertAlign w:val="superscript"/>
               </w:rPr>
               <w:t>2</w:t>
@@ -4932,7 +4820,6 @@
             <w:r>
               <w:rPr>
                 <w:rFonts w:ascii="Times New Roman" w:hAnsi="Times New Roman" w:cs="Times New Roman"/>
-                <w:sz w:val="20"/>
               </w:rPr>
               <w:t>Wilcoxon rank sum test; Pearson's Chi-squared test; Fisher's exact test</w:t>
             </w:r>
@@ -4984,25 +4871,7 @@
           <w:rFonts w:ascii="Times New Roman" w:hAnsi="Times New Roman" w:cs="Times New Roman"/>
         </w:rPr>
         <w:lastRenderedPageBreak/>
-        <w:t xml:space="preserve">Table 2: </w:t>
-      </w:r>
-      <w:r>
-        <w:rPr>
-          <w:rFonts w:ascii="Times New Roman" w:hAnsi="Times New Roman" w:cs="Times New Roman"/>
-        </w:rPr>
-        <w:t>Bayesian analysis, p</w:t>
-      </w:r>
-      <w:r>
-        <w:rPr>
-          <w:rFonts w:ascii="Times New Roman" w:hAnsi="Times New Roman" w:cs="Times New Roman"/>
-        </w:rPr>
-        <w:t xml:space="preserve">osterior </w:t>
-      </w:r>
-      <w:r>
-        <w:rPr>
-          <w:rFonts w:ascii="Times New Roman" w:hAnsi="Times New Roman" w:cs="Times New Roman"/>
-        </w:rPr>
-        <w:t>distribution and model convergence estimates for each treatment response</w:t>
+        <w:t>Table 2: Bayesian analysis, posterior distribution and model convergence estimates for each treatment response</w:t>
       </w:r>
     </w:p>
     <w:tbl>
@@ -5013,15 +4882,15 @@
         <w:tblCaption w:val="Table 2, Posterior distribution estimates and model convergence for all treatment responses"/>
       </w:tblPr>
       <w:tblGrid>
-        <w:gridCol w:w="2330"/>
-        <w:gridCol w:w="2395"/>
-        <w:gridCol w:w="1163"/>
-        <w:gridCol w:w="1203"/>
-        <w:gridCol w:w="1356"/>
-        <w:gridCol w:w="1416"/>
-        <w:gridCol w:w="856"/>
-        <w:gridCol w:w="996"/>
-        <w:gridCol w:w="1243"/>
+        <w:gridCol w:w="1977"/>
+        <w:gridCol w:w="2032"/>
+        <w:gridCol w:w="1005"/>
+        <w:gridCol w:w="1039"/>
+        <w:gridCol w:w="1166"/>
+        <w:gridCol w:w="1216"/>
+        <w:gridCol w:w="750"/>
+        <w:gridCol w:w="866"/>
+        <w:gridCol w:w="1072"/>
       </w:tblGrid>
       <w:tr>
         <w:trPr>
@@ -8527,6 +8396,14 @@
         </w:rPr>
         <w:t>**A reduction in WAIC of 3 points or more is considered meaningful</w:t>
       </w:r>
+    </w:p>
+    <w:p>
+      <w:pPr>
+        <w:spacing w:line="480" w:lineRule="auto"/>
+        <w:rPr>
+          <w:rFonts w:ascii="Times New Roman" w:hAnsi="Times New Roman" w:cs="Times New Roman"/>
+        </w:rPr>
+      </w:pPr>
     </w:p>
     <w:p>
       <w:pPr>
@@ -8580,13 +8457,13 @@
         <w:tblCaption w:val="Table 3a, Mediation analysis: Indirect effect of treatment adherence"/>
       </w:tblPr>
       <w:tblGrid>
-        <w:gridCol w:w="2330"/>
-        <w:gridCol w:w="1163"/>
-        <w:gridCol w:w="1203"/>
-        <w:gridCol w:w="1356"/>
-        <w:gridCol w:w="1356"/>
-        <w:gridCol w:w="1256"/>
-        <w:gridCol w:w="1420"/>
+        <w:gridCol w:w="1977"/>
+        <w:gridCol w:w="1005"/>
+        <w:gridCol w:w="1039"/>
+        <w:gridCol w:w="1166"/>
+        <w:gridCol w:w="1166"/>
+        <w:gridCol w:w="1066"/>
+        <w:gridCol w:w="1200"/>
       </w:tblGrid>
       <w:tr>
         <w:trPr>
@@ -9699,9 +9576,9 @@
         <w:tblCaption w:val="Table 4, Posterior probabilities of a clinically meaning effect"/>
       </w:tblPr>
       <w:tblGrid>
-        <w:gridCol w:w="4575"/>
-        <w:gridCol w:w="1982"/>
-        <w:gridCol w:w="2210"/>
+        <w:gridCol w:w="3846"/>
+        <w:gridCol w:w="1688"/>
+        <w:gridCol w:w="1878"/>
       </w:tblGrid>
       <w:tr>
         <w:trPr>
@@ -10102,7 +9979,19 @@
               <w:rPr>
                 <w:rFonts w:ascii="Times New Roman" w:hAnsi="Times New Roman" w:cs="Times New Roman"/>
               </w:rPr>
-              <w:t>23.78</w:t>
+              <w:t>1</w:t>
+            </w:r>
+            <w:r>
+              <w:rPr>
+                <w:rFonts w:ascii="Times New Roman" w:hAnsi="Times New Roman" w:cs="Times New Roman"/>
+              </w:rPr>
+              <w:t>.8</w:t>
+            </w:r>
+            <w:r>
+              <w:rPr>
+                <w:rFonts w:ascii="Times New Roman" w:hAnsi="Times New Roman" w:cs="Times New Roman"/>
+              </w:rPr>
+              <w:t>0</w:t>
             </w:r>
             <w:r>
               <w:rPr>
@@ -10360,183 +10249,7 @@
           <w:i/>
           <w:iCs/>
         </w:rPr>
-        <w:t>“</w:t>
-      </w:r>
-      <w:r>
-        <w:rPr>
-          <w:rFonts w:ascii="Times New Roman" w:hAnsi="Times New Roman" w:cs="Times New Roman"/>
-          <w:i/>
-          <w:iCs/>
-        </w:rPr>
-        <w:t>C:</w:t>
-      </w:r>
-      <w:r>
-        <w:rPr>
-          <w:rFonts w:ascii="Times New Roman" w:hAnsi="Times New Roman" w:cs="Times New Roman"/>
-          <w:i/>
-          <w:iCs/>
-        </w:rPr>
-        <w:t>/</w:t>
-      </w:r>
-      <w:r>
-        <w:rPr>
-          <w:rFonts w:ascii="Times New Roman" w:hAnsi="Times New Roman" w:cs="Times New Roman"/>
-          <w:i/>
-          <w:iCs/>
-        </w:rPr>
-        <w:t>Users</w:t>
-      </w:r>
-      <w:r>
-        <w:rPr>
-          <w:rFonts w:ascii="Times New Roman" w:hAnsi="Times New Roman" w:cs="Times New Roman"/>
-          <w:i/>
-          <w:iCs/>
-        </w:rPr>
-        <w:t>/</w:t>
-      </w:r>
-      <w:r>
-        <w:rPr>
-          <w:rFonts w:ascii="Times New Roman" w:hAnsi="Times New Roman" w:cs="Times New Roman"/>
-          <w:i/>
-          <w:iCs/>
-        </w:rPr>
-        <w:t>Owner</w:t>
-      </w:r>
-      <w:r>
-        <w:rPr>
-          <w:rFonts w:ascii="Times New Roman" w:hAnsi="Times New Roman" w:cs="Times New Roman"/>
-          <w:i/>
-          <w:iCs/>
-        </w:rPr>
-        <w:t>/</w:t>
-      </w:r>
-      <w:r>
-        <w:rPr>
-          <w:rFonts w:ascii="Times New Roman" w:hAnsi="Times New Roman" w:cs="Times New Roman"/>
-          <w:i/>
-          <w:iCs/>
-        </w:rPr>
-        <w:t>Documents</w:t>
-      </w:r>
-      <w:r>
-        <w:rPr>
-          <w:rFonts w:ascii="Times New Roman" w:hAnsi="Times New Roman" w:cs="Times New Roman"/>
-          <w:i/>
-          <w:iCs/>
-        </w:rPr>
-        <w:t>/</w:t>
-      </w:r>
-      <w:r>
-        <w:rPr>
-          <w:rFonts w:ascii="Times New Roman" w:hAnsi="Times New Roman" w:cs="Times New Roman"/>
-          <w:i/>
-          <w:iCs/>
-        </w:rPr>
-        <w:t>cuclasses</w:t>
-      </w:r>
-      <w:r>
-        <w:rPr>
-          <w:rFonts w:ascii="Times New Roman" w:hAnsi="Times New Roman" w:cs="Times New Roman"/>
-          <w:i/>
-          <w:iCs/>
-        </w:rPr>
-        <w:t>/</w:t>
-      </w:r>
-      <w:r>
-        <w:rPr>
-          <w:rFonts w:ascii="Times New Roman" w:hAnsi="Times New Roman" w:cs="Times New Roman"/>
-          <w:i/>
-          <w:iCs/>
-        </w:rPr>
-        <w:t>spring26</w:t>
-      </w:r>
-      <w:r>
-        <w:rPr>
-          <w:rFonts w:ascii="Times New Roman" w:hAnsi="Times New Roman" w:cs="Times New Roman"/>
-          <w:i/>
-          <w:iCs/>
-        </w:rPr>
-        <w:t>/</w:t>
-      </w:r>
-      <w:r>
-        <w:rPr>
-          <w:rFonts w:ascii="Times New Roman" w:hAnsi="Times New Roman" w:cs="Times New Roman"/>
-          <w:i/>
-          <w:iCs/>
-        </w:rPr>
-        <w:t>bios_6624</w:t>
-      </w:r>
-      <w:r>
-        <w:rPr>
-          <w:rFonts w:ascii="Times New Roman" w:hAnsi="Times New Roman" w:cs="Times New Roman"/>
-          <w:i/>
-          <w:iCs/>
-        </w:rPr>
-        <w:t>/</w:t>
-      </w:r>
-      <w:r>
-        <w:rPr>
-          <w:rFonts w:ascii="Times New Roman" w:hAnsi="Times New Roman" w:cs="Times New Roman"/>
-          <w:i/>
-          <w:iCs/>
-        </w:rPr>
-        <w:t>BIOS6624</w:t>
-      </w:r>
-      <w:r>
-        <w:rPr>
-          <w:rFonts w:ascii="Times New Roman" w:hAnsi="Times New Roman" w:cs="Times New Roman"/>
-          <w:i/>
-          <w:iCs/>
-        </w:rPr>
-        <w:t>/</w:t>
-      </w:r>
-      <w:r>
-        <w:rPr>
-          <w:rFonts w:ascii="Times New Roman" w:hAnsi="Times New Roman" w:cs="Times New Roman"/>
-          <w:i/>
-          <w:iCs/>
-        </w:rPr>
-        <w:t>Project1</w:t>
-      </w:r>
-      <w:r>
-        <w:rPr>
-          <w:rFonts w:ascii="Times New Roman" w:hAnsi="Times New Roman" w:cs="Times New Roman"/>
-          <w:i/>
-          <w:iCs/>
-        </w:rPr>
-        <w:t>/</w:t>
-      </w:r>
-      <w:r>
-        <w:rPr>
-          <w:rFonts w:ascii="Times New Roman" w:hAnsi="Times New Roman" w:cs="Times New Roman"/>
-          <w:i/>
-          <w:iCs/>
-        </w:rPr>
-        <w:t>DataRaw</w:t>
-      </w:r>
-      <w:r>
-        <w:rPr>
-          <w:rFonts w:ascii="Times New Roman" w:hAnsi="Times New Roman" w:cs="Times New Roman"/>
-          <w:i/>
-          <w:iCs/>
-        </w:rPr>
-        <w:t>/</w:t>
-      </w:r>
-      <w:r>
-        <w:rPr>
-          <w:rFonts w:ascii="Times New Roman" w:hAnsi="Times New Roman" w:cs="Times New Roman"/>
-          <w:i/>
-          <w:iCs/>
-        </w:rPr>
-        <w:t>hiv_6624_final.csv</w:t>
-      </w:r>
-      <w:r>
-        <w:rPr>
-          <w:rFonts w:ascii="Times New Roman" w:hAnsi="Times New Roman" w:cs="Times New Roman"/>
-          <w:i/>
-          <w:iCs/>
-        </w:rPr>
-        <w:t>”</w:t>
+        <w:t>“C:/Users/Owner/Documents/cuclasses/spring26/bios_6624/BIOS6624/Project1/DataRaw/hiv_6624_final.csv”</w:t>
       </w:r>
     </w:p>
     <w:p>
@@ -10563,23 +10276,7 @@
           <w:i/>
           <w:iCs/>
         </w:rPr>
-        <w:t>“C:/Users/Owner/Documents/cuclasses/spring26/bios_6624/BIOS6624/Project1/DataProcessed</w:t>
-      </w:r>
-      <w:r>
-        <w:rPr>
-          <w:rFonts w:ascii="Times New Roman" w:hAnsi="Times New Roman" w:cs="Times New Roman"/>
-          <w:i/>
-          <w:iCs/>
-        </w:rPr>
-        <w:t>/</w:t>
-      </w:r>
-      <w:r>
-        <w:rPr>
-          <w:rFonts w:ascii="Times New Roman" w:hAnsi="Times New Roman" w:cs="Times New Roman"/>
-          <w:i/>
-          <w:iCs/>
-        </w:rPr>
-        <w:t>hiv_6624_clean.csv”</w:t>
+        <w:t>“C:/Users/Owner/Documents/cuclasses/spring26/bios_6624/BIOS6624/Project1/DataProcessed/hiv_6624_clean.csv”</w:t>
       </w:r>
     </w:p>
     <w:p>
@@ -10594,6 +10291,7 @@
           <w:rFonts w:ascii="Times New Roman" w:hAnsi="Times New Roman" w:cs="Times New Roman"/>
         </w:rPr>
       </w:pPr>
+      <w:proofErr w:type="gramStart"/>
       <w:r>
         <w:rPr>
           <w:rFonts w:ascii="Times New Roman" w:hAnsi="Times New Roman" w:cs="Times New Roman"/>
@@ -10608,6 +10306,7 @@
         <w:t>gitignore</w:t>
       </w:r>
       <w:proofErr w:type="spellEnd"/>
+      <w:proofErr w:type="gramEnd"/>
       <w:r>
         <w:rPr>
           <w:rFonts w:ascii="Times New Roman" w:hAnsi="Times New Roman" w:cs="Times New Roman"/>
@@ -10635,23 +10334,7 @@
           <w:i/>
           <w:iCs/>
         </w:rPr>
-        <w:t>“C:/Users/Owner/Documents/cuclasses/spring26/bios_6624/BIOS6624/Project1/</w:t>
-      </w:r>
-      <w:r>
-        <w:rPr>
-          <w:rFonts w:ascii="Times New Roman" w:hAnsi="Times New Roman" w:cs="Times New Roman"/>
-          <w:i/>
-          <w:iCs/>
-        </w:rPr>
-        <w:t>Code</w:t>
-      </w:r>
-      <w:r>
-        <w:rPr>
-          <w:rFonts w:ascii="Times New Roman" w:hAnsi="Times New Roman" w:cs="Times New Roman"/>
-          <w:i/>
-          <w:iCs/>
-        </w:rPr>
-        <w:t>/linear_regression_half_normal.exe”</w:t>
+        <w:t>“C:/Users/Owner/Documents/cuclasses/spring26/bios_6624/BIOS6624/Project1/Code/linear_regression_half_normal.exe”</w:t>
       </w:r>
     </w:p>
     <w:p>
@@ -10718,8 +10401,16 @@
         <w:rPr>
           <w:rFonts w:ascii="Times New Roman" w:hAnsi="Times New Roman" w:cs="Times New Roman"/>
         </w:rPr>
-        <w:t>P1_clean_and_analyses.R</w:t>
-      </w:r>
+        <w:t>P1_clean_and_</w:t>
+      </w:r>
+      <w:proofErr w:type="gramStart"/>
+      <w:r>
+        <w:rPr>
+          <w:rFonts w:ascii="Times New Roman" w:hAnsi="Times New Roman" w:cs="Times New Roman"/>
+        </w:rPr>
+        <w:t>analyses.R</w:t>
+      </w:r>
+      <w:proofErr w:type="gramEnd"/>
       <w:r>
         <w:rPr>
           <w:rFonts w:ascii="Times New Roman" w:hAnsi="Times New Roman" w:cs="Times New Roman"/>
@@ -10773,23 +10464,7 @@
           <w:i/>
           <w:iCs/>
         </w:rPr>
-        <w:t>“C:/Users/Owner/Documents/cuclasses/spring26/bios_6624/BIOS6624/Project1/</w:t>
-      </w:r>
-      <w:r>
-        <w:rPr>
-          <w:rFonts w:ascii="Times New Roman" w:hAnsi="Times New Roman" w:cs="Times New Roman"/>
-          <w:i/>
-          <w:iCs/>
-        </w:rPr>
-        <w:t>Reports</w:t>
-      </w:r>
-      <w:r>
-        <w:rPr>
-          <w:rFonts w:ascii="Times New Roman" w:hAnsi="Times New Roman" w:cs="Times New Roman"/>
-          <w:i/>
-          <w:iCs/>
-        </w:rPr>
-        <w:t>/project1_report_YemiJegede.Rmd”</w:t>
+        <w:t>“C:/Users/Owner/Documents/cuclasses/spring26/bios_6624/BIOS6624/Project1/Reports/project1_report_YemiJegede.Rmd”</w:t>
       </w:r>
       <w:r>
         <w:rPr>
@@ -11600,7 +11275,21 @@
         <w:rPr>
           <w:rFonts w:ascii="Times New Roman" w:hAnsi="Times New Roman" w:cs="Times New Roman"/>
         </w:rPr>
-        <w:t xml:space="preserve">it is required that the mediator variable is associated with the key predictor which as noted above treatment adherence is not associated with hard drug use. This association was not formally assessed however, it </w:t>
+        <w:t xml:space="preserve">it is required that the mediator variable is associated with the key predictor which as noted above treatment adherence is not associated with hard drug use. This association was not formally assessed </w:t>
+      </w:r>
+      <w:proofErr w:type="gramStart"/>
+      <w:r>
+        <w:rPr>
+          <w:rFonts w:ascii="Times New Roman" w:hAnsi="Times New Roman" w:cs="Times New Roman"/>
+        </w:rPr>
+        <w:t>however,</w:t>
+      </w:r>
+      <w:proofErr w:type="gramEnd"/>
+      <w:r>
+        <w:rPr>
+          <w:rFonts w:ascii="Times New Roman" w:hAnsi="Times New Roman" w:cs="Times New Roman"/>
+        </w:rPr>
+        <w:t xml:space="preserve"> it </w:t>
       </w:r>
       <w:r>
         <w:rPr>
@@ -11673,13 +11362,7 @@
         <w:rPr>
           <w:rFonts w:ascii="Times New Roman" w:hAnsi="Times New Roman" w:cs="Times New Roman"/>
         </w:rPr>
-        <w:t xml:space="preserve">In the Bayesian framework, the posterior distribution of the indirect effect of treatment adherence (TAie) was obtained by taking the difference between the posterior distribution draws </w:t>
-      </w:r>
-      <w:r>
-        <w:rPr>
-          <w:rFonts w:ascii="Times New Roman" w:hAnsi="Times New Roman" w:cs="Times New Roman"/>
-        </w:rPr>
-        <w:t>(</w:t>
+        <w:t>In the Bayesian framework, the posterior distribution of the indirect effect of treatment adherence (TAie) was obtained by taking the difference between the posterior distribution draws (</w:t>
       </w:r>
       <w:proofErr w:type="spellStart"/>
       <w:r>
@@ -11693,13 +11376,35 @@
         <w:rPr>
           <w:rFonts w:ascii="Times New Roman" w:hAnsi="Times New Roman" w:cs="Times New Roman"/>
         </w:rPr>
-        <w:t xml:space="preserve">) </w:t>
-      </w:r>
-      <w:r>
-        <w:rPr>
-          <w:rFonts w:ascii="Times New Roman" w:hAnsi="Times New Roman" w:cs="Times New Roman"/>
-        </w:rPr>
-        <w:t>for the key predictor (hard drug use, HDU) in the crude and adjusted model, that is PD TAie = PD HDU Crude – PD HDU Adjusted. The posterior mean of PD TAie and 95% HPDI was reported as the estimate and credible interval of the indirect effect mediation by treatment adherence. If the absolute value of the posterior mean of PD TAie is greater than the investigator-specified clinically meaningful difference (provided in the main Methods section above) for any of the outcomes, then it is concluded that treatment adherence mediates the association between the outcome and hard drug use.</w:t>
+        <w:t xml:space="preserve">) for the key predictor (hard drug use, HDU) in the crude and adjusted model, that is PD TAie = PD HDU Crude – PD HDU Adjusted. The posterior </w:t>
+      </w:r>
+      <w:proofErr w:type="gramStart"/>
+      <w:r>
+        <w:rPr>
+          <w:rFonts w:ascii="Times New Roman" w:hAnsi="Times New Roman" w:cs="Times New Roman"/>
+        </w:rPr>
+        <w:t>mean</w:t>
+      </w:r>
+      <w:proofErr w:type="gramEnd"/>
+      <w:r>
+        <w:rPr>
+          <w:rFonts w:ascii="Times New Roman" w:hAnsi="Times New Roman" w:cs="Times New Roman"/>
+        </w:rPr>
+        <w:t xml:space="preserve"> of PD TAie and 95% HPDI was reported as the estimate and credible interval of the </w:t>
+      </w:r>
+      <w:proofErr w:type="gramStart"/>
+      <w:r>
+        <w:rPr>
+          <w:rFonts w:ascii="Times New Roman" w:hAnsi="Times New Roman" w:cs="Times New Roman"/>
+        </w:rPr>
+        <w:t>indirect effect</w:t>
+      </w:r>
+      <w:proofErr w:type="gramEnd"/>
+      <w:r>
+        <w:rPr>
+          <w:rFonts w:ascii="Times New Roman" w:hAnsi="Times New Roman" w:cs="Times New Roman"/>
+        </w:rPr>
+        <w:t xml:space="preserve"> mediation by treatment adherence. If the absolute value of the posterior mean of PD TAie is greater than the investigator-specified clinically meaningful difference (provided in the main Methods section above) for any of the outcomes, then it is concluded that treatment adherence mediates the association between the outcome and hard drug use.</w:t>
       </w:r>
     </w:p>
     <w:p>
@@ -11761,13 +11466,7 @@
           <w:rFonts w:ascii="Times New Roman" w:hAnsi="Times New Roman" w:cs="Times New Roman"/>
         </w:rPr>
         <w:lastRenderedPageBreak/>
-        <w:t>Supplementary Table 1: Di</w:t>
-      </w:r>
-      <w:r>
-        <w:rPr>
-          <w:rFonts w:ascii="Times New Roman" w:hAnsi="Times New Roman" w:cs="Times New Roman"/>
-        </w:rPr>
-        <w:t>stribution and comparison of treatment response and demographic variables at baseline and year 2 follow-up, stratified by hard drug use status at baseline.</w:t>
+        <w:t>Supplementary Table 1: Distribution and comparison of treatment response and demographic variables at baseline and year 2 follow-up, stratified by hard drug use status at baseline.</w:t>
       </w:r>
     </w:p>
     <w:tbl>
@@ -11951,16 +11650,7 @@
                 <w:sz w:val="16"/>
                 <w:szCs w:val="16"/>
               </w:rPr>
-              <w:t>Hard Drug Use at Baseline</w:t>
-            </w:r>
-            <w:r>
-              <w:rPr>
-                <w:rFonts w:ascii="Times New Roman" w:hAnsi="Times New Roman" w:cs="Times New Roman"/>
-                <w:b/>
-                <w:sz w:val="16"/>
-                <w:szCs w:val="16"/>
-              </w:rPr>
-              <w:t>?</w:t>
+              <w:t>Hard Drug Use at Baseline?</w:t>
             </w:r>
           </w:p>
         </w:tc>
@@ -21006,19 +20696,7 @@
         <w:rPr>
           <w:rFonts w:ascii="Times New Roman" w:hAnsi="Times New Roman" w:cs="Times New Roman"/>
         </w:rPr>
-        <w:t xml:space="preserve"> Posterior mean, HPDI, and diagnostics for the crude model by </w:t>
-      </w:r>
-      <w:r>
-        <w:rPr>
-          <w:rFonts w:ascii="Times New Roman" w:hAnsi="Times New Roman" w:cs="Times New Roman"/>
-        </w:rPr>
-        <w:t>treatment</w:t>
-      </w:r>
-      <w:r>
-        <w:rPr>
-          <w:rFonts w:ascii="Times New Roman" w:hAnsi="Times New Roman" w:cs="Times New Roman"/>
-        </w:rPr>
-        <w:t xml:space="preserve"> response</w:t>
+        <w:t xml:space="preserve"> Posterior mean, HPDI, and diagnostics for the crude model by treatment response</w:t>
       </w:r>
     </w:p>
     <w:tbl>
@@ -36172,23 +35850,7 @@
           <w:i w:val="0"/>
           <w:iCs/>
         </w:rPr>
-        <w:t>Figure 1</w:t>
-      </w:r>
-      <w:r>
-        <w:rPr>
-          <w:rFonts w:ascii="Times New Roman" w:hAnsi="Times New Roman" w:cs="Times New Roman"/>
-          <w:i w:val="0"/>
-          <w:iCs/>
-        </w:rPr>
-        <w:t xml:space="preserve">: </w:t>
-      </w:r>
-      <w:r>
-        <w:rPr>
-          <w:rFonts w:ascii="Times New Roman" w:hAnsi="Times New Roman" w:cs="Times New Roman"/>
-          <w:i w:val="0"/>
-          <w:iCs/>
-        </w:rPr>
-        <w:t>Correlation matrix plot showing scatter plot (in the lower diagonal), histogram (on the diagonal), and Pearson correlation coefficient among variable pairs in the final, clean data</w:t>
+        <w:t>Figure 1: Correlation matrix plot showing scatter plot (in the lower diagonal), histogram (on the diagonal), and Pearson correlation coefficient among variable pairs in the final, clean data</w:t>
       </w:r>
     </w:p>
     <w:p>
@@ -36201,6 +35863,7 @@
       <w:r>
         <w:rPr>
           <w:rFonts w:ascii="Times New Roman" w:hAnsi="Times New Roman" w:cs="Times New Roman"/>
+          <w:noProof/>
         </w:rPr>
         <w:drawing>
           <wp:inline distT="0" distB="0" distL="0" distR="0" wp14:anchorId="76C85E2D" wp14:editId="2BF6BDC6">
@@ -36280,6 +35943,7 @@
       <w:r>
         <w:rPr>
           <w:rFonts w:ascii="Times New Roman" w:hAnsi="Times New Roman" w:cs="Times New Roman"/>
+          <w:noProof/>
         </w:rPr>
         <w:drawing>
           <wp:inline distT="0" distB="0" distL="0" distR="0" wp14:anchorId="22753549" wp14:editId="5B458F3D">
@@ -36327,6 +35991,7 @@
       <w:r>
         <w:rPr>
           <w:rFonts w:ascii="Times New Roman" w:hAnsi="Times New Roman" w:cs="Times New Roman"/>
+          <w:noProof/>
         </w:rPr>
         <w:lastRenderedPageBreak/>
         <w:drawing>
@@ -36375,6 +36040,7 @@
       <w:r>
         <w:rPr>
           <w:rFonts w:ascii="Times New Roman" w:hAnsi="Times New Roman" w:cs="Times New Roman"/>
+          <w:noProof/>
         </w:rPr>
         <w:lastRenderedPageBreak/>
         <w:drawing>
@@ -36492,19 +36158,7 @@
         <w:rPr>
           <w:rFonts w:ascii="Times New Roman" w:hAnsi="Times New Roman" w:cs="Times New Roman"/>
         </w:rPr>
-        <w:t xml:space="preserve"> Autocorrelation, trace, and chains overlay plot for the </w:t>
-      </w:r>
-      <w:r>
-        <w:rPr>
-          <w:rFonts w:ascii="Times New Roman" w:hAnsi="Times New Roman" w:cs="Times New Roman"/>
-        </w:rPr>
-        <w:t>Mental</w:t>
-      </w:r>
-      <w:r>
-        <w:rPr>
-          <w:rFonts w:ascii="Times New Roman" w:hAnsi="Times New Roman" w:cs="Times New Roman"/>
-        </w:rPr>
-        <w:t xml:space="preserve"> QoL </w:t>
+        <w:t xml:space="preserve"> Autocorrelation, trace, and chains overlay plot for the Mental QoL </w:t>
       </w:r>
       <w:r>
         <w:rPr>
@@ -36528,6 +36182,7 @@
       <w:r>
         <w:rPr>
           <w:rFonts w:ascii="Times New Roman" w:hAnsi="Times New Roman" w:cs="Times New Roman"/>
+          <w:noProof/>
         </w:rPr>
         <w:drawing>
           <wp:inline distT="0" distB="0" distL="0" distR="0" wp14:anchorId="4DE00F18" wp14:editId="0446FCA6">
@@ -36575,6 +36230,7 @@
       <w:r>
         <w:rPr>
           <w:rFonts w:ascii="Times New Roman" w:hAnsi="Times New Roman" w:cs="Times New Roman"/>
+          <w:noProof/>
         </w:rPr>
         <w:lastRenderedPageBreak/>
         <w:drawing>
@@ -36630,6 +36286,7 @@
       <w:r>
         <w:rPr>
           <w:rFonts w:ascii="Times New Roman" w:hAnsi="Times New Roman" w:cs="Times New Roman"/>
+          <w:noProof/>
         </w:rPr>
         <w:lastRenderedPageBreak/>
         <w:drawing>
@@ -36747,19 +36404,7 @@
         <w:rPr>
           <w:rFonts w:ascii="Times New Roman" w:hAnsi="Times New Roman" w:cs="Times New Roman"/>
         </w:rPr>
-        <w:t xml:space="preserve"> Autocorrelation, trace, and chains overlay plot for the </w:t>
-      </w:r>
-      <w:r>
-        <w:rPr>
-          <w:rFonts w:ascii="Times New Roman" w:hAnsi="Times New Roman" w:cs="Times New Roman"/>
-        </w:rPr>
-        <w:t xml:space="preserve">CD4+ T-cell crude </w:t>
-      </w:r>
-      <w:r>
-        <w:rPr>
-          <w:rFonts w:ascii="Times New Roman" w:hAnsi="Times New Roman" w:cs="Times New Roman"/>
-        </w:rPr>
-        <w:t>model</w:t>
+        <w:t xml:space="preserve"> Autocorrelation, trace, and chains overlay plot for the CD4+ T-cell crude model</w:t>
       </w:r>
     </w:p>
     <w:p>
@@ -36771,6 +36416,7 @@
       <w:r>
         <w:rPr>
           <w:rFonts w:ascii="Times New Roman" w:hAnsi="Times New Roman" w:cs="Times New Roman"/>
+          <w:noProof/>
         </w:rPr>
         <w:drawing>
           <wp:inline distT="0" distB="0" distL="0" distR="0" wp14:anchorId="60FF209A" wp14:editId="476C99CA">
@@ -36818,6 +36464,7 @@
       <w:r>
         <w:rPr>
           <w:rFonts w:ascii="Times New Roman" w:hAnsi="Times New Roman" w:cs="Times New Roman"/>
+          <w:noProof/>
         </w:rPr>
         <w:lastRenderedPageBreak/>
         <w:drawing>
@@ -36866,6 +36513,7 @@
       <w:r>
         <w:rPr>
           <w:rFonts w:ascii="Times New Roman" w:hAnsi="Times New Roman" w:cs="Times New Roman"/>
+          <w:noProof/>
         </w:rPr>
         <w:lastRenderedPageBreak/>
         <w:drawing>
@@ -36983,19 +36631,7 @@
         <w:rPr>
           <w:rFonts w:ascii="Times New Roman" w:hAnsi="Times New Roman" w:cs="Times New Roman"/>
         </w:rPr>
-        <w:t xml:space="preserve"> Autocorrelation, trace, and chains overlay plot for the CD4+ T-cell </w:t>
-      </w:r>
-      <w:r>
-        <w:rPr>
-          <w:rFonts w:ascii="Times New Roman" w:hAnsi="Times New Roman" w:cs="Times New Roman"/>
-        </w:rPr>
-        <w:t>crude</w:t>
-      </w:r>
-      <w:r>
-        <w:rPr>
-          <w:rFonts w:ascii="Times New Roman" w:hAnsi="Times New Roman" w:cs="Times New Roman"/>
-        </w:rPr>
-        <w:t xml:space="preserve"> model</w:t>
+        <w:t xml:space="preserve"> Autocorrelation, trace, and chains overlay plot for the CD4+ T-cell crude model</w:t>
       </w:r>
     </w:p>
     <w:p>
@@ -37007,6 +36643,7 @@
       <w:r>
         <w:rPr>
           <w:rFonts w:ascii="Times New Roman" w:hAnsi="Times New Roman" w:cs="Times New Roman"/>
+          <w:noProof/>
         </w:rPr>
         <w:drawing>
           <wp:inline distT="0" distB="0" distL="0" distR="0" wp14:anchorId="5758DBDD" wp14:editId="16B1705D">
@@ -37054,6 +36691,7 @@
       <w:r>
         <w:rPr>
           <w:rFonts w:ascii="Times New Roman" w:hAnsi="Times New Roman" w:cs="Times New Roman"/>
+          <w:noProof/>
         </w:rPr>
         <w:lastRenderedPageBreak/>
         <w:drawing>
@@ -37109,6 +36747,7 @@
       <w:r>
         <w:rPr>
           <w:rFonts w:ascii="Times New Roman" w:hAnsi="Times New Roman" w:cs="Times New Roman"/>
+          <w:noProof/>
         </w:rPr>
         <w:lastRenderedPageBreak/>
         <w:drawing>
@@ -38079,6 +37718,7 @@
   <w:style w:type="character" w:default="1" w:styleId="DefaultParagraphFont">
     <w:name w:val="Default Paragraph Font"/>
     <w:uiPriority w:val="1"/>
+    <w:semiHidden/>
     <w:unhideWhenUsed/>
   </w:style>
   <w:style w:type="table" w:default="1" w:styleId="TableNormal">
@@ -38458,6 +38098,8 @@
     </w:pPr>
     <w:rPr>
       <w:kern w:val="0"/>
+      <w:sz w:val="20"/>
+      <w:szCs w:val="20"/>
       <w14:ligatures w14:val="none"/>
     </w:rPr>
     <w:tblPr>

</xml_diff>